<commit_message>
docs: regenerate design & roadmap .docx to v0.3.0
Mirror ARCHITECTURE.md v0.3.0: marketplace readiness (seller/listing model) and ERP inventory & replenishment sections, plus roadmap phases 6 and 7.

Co-Authored-By: Claude Opus 4.8 <noreply@anthropic.com>
</commit_message>
<xml_diff>
--- a/docs/BeyondGorgeous-Design-and-Roadmap.docx
+++ b/docs/BeyondGorgeous-Design-and-Roadmap.docx
@@ -296,7 +296,7 @@
                 <w:sz w:val="19"/>
                 <w:szCs w:val="19"/>
               </w:rPr>
-              <w:t xml:space="preserve">0.2.0 (aligned with ARCHITECTURE.md)</w:t>
+              <w:t xml:space="preserve">0.3.0 (aligned with ARCHITECTURE.md)</w:t>
             </w:r>
           </w:p>
         </w:tc>
@@ -2081,6 +2081,120 @@
                 <w:sz w:val="19"/>
                 <w:szCs w:val="19"/>
               </w:rPr>
+              <w:t xml:space="preserve">Inventory &amp; replenishment (ERP)</w:t>
+            </w:r>
+          </w:p>
+        </w:tc>
+        <w:tc>
+          <w:tcPr>
+            <w:tcW w:type="dxa" w:w="6360"/>
+            <w:tcBorders>
+              <w:top w:val="single" w:color="D9D2D5" w:sz="1"/>
+              <w:left w:val="single" w:color="D9D2D5" w:sz="1"/>
+              <w:bottom w:val="single" w:color="D9D2D5" w:sz="1"/>
+              <w:right w:val="single" w:color="D9D2D5" w:sz="1"/>
+            </w:tcBorders>
+            <w:tcMar>
+              <w:top w:type="dxa" w:w="70"/>
+              <w:left w:type="dxa" w:w="110"/>
+              <w:bottom w:type="dxa" w:w="70"/>
+              <w:right w:type="dxa" w:w="110"/>
+            </w:tcMar>
+            <w:vAlign w:val="center"/>
+          </w:tcPr>
+          <w:p>
+            <w:r>
+              <w:rPr>
+                <w:sz w:val="19"/>
+                <w:szCs w:val="19"/>
+              </w:rPr>
+              <w:t xml:space="preserve">Stock ledger, safety stock, auto-reorder/alerts (Phase 6 future track)</w:t>
+            </w:r>
+          </w:p>
+        </w:tc>
+      </w:tr>
+      <w:tr>
+        <w:tc>
+          <w:tcPr>
+            <w:tcW w:type="dxa" w:w="3000"/>
+            <w:tcBorders>
+              <w:top w:val="single" w:color="D9D2D5" w:sz="1"/>
+              <w:left w:val="single" w:color="D9D2D5" w:sz="1"/>
+              <w:bottom w:val="single" w:color="D9D2D5" w:sz="1"/>
+              <w:right w:val="single" w:color="D9D2D5" w:sz="1"/>
+            </w:tcBorders>
+            <w:shd w:fill="FAF5F7" w:color="auto" w:val="clear"/>
+            <w:tcMar>
+              <w:top w:type="dxa" w:w="70"/>
+              <w:left w:type="dxa" w:w="110"/>
+              <w:bottom w:type="dxa" w:w="70"/>
+              <w:right w:type="dxa" w:w="110"/>
+            </w:tcMar>
+            <w:vAlign w:val="center"/>
+          </w:tcPr>
+          <w:p>
+            <w:r>
+              <w:rPr>
+                <w:sz w:val="19"/>
+                <w:szCs w:val="19"/>
+              </w:rPr>
+              <w:t xml:space="preserve">Marketplace readiness</w:t>
+            </w:r>
+          </w:p>
+        </w:tc>
+        <w:tc>
+          <w:tcPr>
+            <w:tcW w:type="dxa" w:w="6360"/>
+            <w:tcBorders>
+              <w:top w:val="single" w:color="D9D2D5" w:sz="1"/>
+              <w:left w:val="single" w:color="D9D2D5" w:sz="1"/>
+              <w:bottom w:val="single" w:color="D9D2D5" w:sz="1"/>
+              <w:right w:val="single" w:color="D9D2D5" w:sz="1"/>
+            </w:tcBorders>
+            <w:shd w:fill="FAF5F7" w:color="auto" w:val="clear"/>
+            <w:tcMar>
+              <w:top w:type="dxa" w:w="70"/>
+              <w:left w:type="dxa" w:w="110"/>
+              <w:bottom w:type="dxa" w:w="70"/>
+              <w:right w:type="dxa" w:w="110"/>
+            </w:tcMar>
+            <w:vAlign w:val="center"/>
+          </w:tcPr>
+          <w:p>
+            <w:r>
+              <w:rPr>
+                <w:sz w:val="19"/>
+                <w:szCs w:val="19"/>
+              </w:rPr>
+              <w:t xml:space="preserve">Seller-aware, listing-based design; build deferred to a future track</w:t>
+            </w:r>
+          </w:p>
+        </w:tc>
+      </w:tr>
+      <w:tr>
+        <w:tc>
+          <w:tcPr>
+            <w:tcW w:type="dxa" w:w="3000"/>
+            <w:tcBorders>
+              <w:top w:val="single" w:color="D9D2D5" w:sz="1"/>
+              <w:left w:val="single" w:color="D9D2D5" w:sz="1"/>
+              <w:bottom w:val="single" w:color="D9D2D5" w:sz="1"/>
+              <w:right w:val="single" w:color="D9D2D5" w:sz="1"/>
+            </w:tcBorders>
+            <w:tcMar>
+              <w:top w:type="dxa" w:w="70"/>
+              <w:left w:type="dxa" w:w="110"/>
+              <w:bottom w:type="dxa" w:w="70"/>
+              <w:right w:type="dxa" w:w="110"/>
+            </w:tcMar>
+            <w:vAlign w:val="center"/>
+          </w:tcPr>
+          <w:p>
+            <w:r>
+              <w:rPr>
+                <w:sz w:val="19"/>
+                <w:szCs w:val="19"/>
+              </w:rPr>
               <w:t xml:space="preserve">Shipping integration</w:t>
             </w:r>
           </w:p>
@@ -2272,7 +2386,7 @@
         <w:spacing w:after="60" w:line="270"/>
       </w:pPr>
       <w:r>
-        <w:t xml:space="preserve">Marketplace of third-party sellers (this is a single-brand store, not an open marketplace).</w:t>
+        <w:t xml:space="preserve">Building the third-party-seller marketplace (seller portal, commissions, payouts). The architecture is designed to support it — single-seller at launch, marketplace-ready — but the build is a deferred future track.</w:t>
       </w:r>
     </w:p>
     <w:p>
@@ -2997,6 +3111,22 @@
     </w:p>
     <w:p>
       <w:pPr>
+        <w:spacing w:after="80"/>
+      </w:pPr>
+      <w:r>
+        <w:t xml:space="preserve"/>
+      </w:r>
+    </w:p>
+    <w:p>
+      <w:pPr>
+        <w:spacing w:after="120" w:line="276"/>
+      </w:pPr>
+      <w:r>
+        <w:t xml:space="preserve">The platform launches single-seller but is designed seller-aware: a catalog product is separated from a seller’s listing (offer), and cart and orders reference the listing. Opening to third-party sellers later is therefore additive, not a redesign (see the Marketplace readiness and roadmap sections).</w:t>
+      </w:r>
+    </w:p>
+    <w:p>
+      <w:pPr>
         <w:pStyle w:val="Heading1"/>
       </w:pPr>
       <w:r>
@@ -4422,7 +4552,7 @@
         <w:spacing w:after="120" w:line="276"/>
       </w:pPr>
       <w:r>
-        <w:t xml:space="preserve">Stored in Cloudflare D1 (SQL). Catalog entities: categories (hierarchical), brands, products, variants (shade/size, each with its own SKU, price, and images), product images, attributes, and tags. Inventory entities: locations (our warehouse(s) and each vendor source) and inventory (stock per variant per location, with reserved quantity to prevent overselling). Vendor &amp; ingestion entities: vendors, ingestion_sources (how a vendor sends data), field_mappings (their fields to ours), ingestion_batches (each run/file/email, for audit), staging_items (rows awaiting approval), and vendor_products (their SKU mapped to our variant). Later phases add customers, addresses, carts, orders, shipments, payments, reviews, and support tickets.</w:t>
+        <w:t xml:space="preserve">Stored in Cloudflare D1 (SQL), grouped by concern. Catalog (the “what”): categories (hierarchical), brands, products (the canonical spec), variants (shade/size SKUs), images, attributes, tags. Marketplace (the “who sells it”): sellers (the house seller seeded as #1) and listings/offers (a seller’s price, stock, and fulfilment on a variant — cart and orders reference listings). Inventory &amp; fulfilment: locations (warehouse and vendor sources), a stock ledger of movements with a derived snapshot (on-hand, reserved, available), reorder policies, and purchase orders. Vendor &amp; ingestion: vendors, ingestion sources, field mappings, ingestion batches, staging items, and vendor-product mappings. Later phases add customers, addresses, carts, orders, shipments, payments, seller payouts, reviews, and support tickets.</w:t>
       </w:r>
     </w:p>
     <w:p>
@@ -5512,7 +5642,7 @@
         <w:pStyle w:val="Heading2"/>
       </w:pPr>
       <w:r>
-        <w:t xml:space="preserve">5.7 SEO architecture</w:t>
+        <w:t xml:space="preserve">5.7 Marketplace readiness</w:t>
       </w:r>
     </w:p>
     <w:p>
@@ -5520,7 +5650,102 @@
         <w:spacing w:after="120" w:line="276"/>
       </w:pPr>
       <w:r>
-        <w:t xml:space="preserve">SEO is a rendering decision, not a late add-on. All public pages are server-side rendered so Google receives complete HTML. URLs are clean and keyword-rich; slugs are stable. Each page emits a unique title, meta description, and canonical URL. Structured data (JSON-LD) for Product, BreadcrumbList, Organization, and WebSite drives rich results — price, star ratings, and breadcrumbs — in Google. An auto-generated XML sitemap and robots.txt support crawling, and the site is registered in Google Search Console. Action item carried into Phase 1: the current category page is a client component and must be rebuilt server-side for SEO.</w:t>
+        <w:t xml:space="preserve">Launch posture is single-seller; the design is seller-aware so opening to third-party sellers later is additive, not a rebuild. The hinge: separate the catalog product from the sellable listing (offer), and have cart and orders reference the listing.</w:t>
+      </w:r>
+    </w:p>
+    <w:p>
+      <w:pPr>
+        <w:pStyle w:val="ListParagraph"/>
+        <w:numPr>
+          <w:ilvl w:val="0"/>
+          <w:numId w:val="2"/>
+        </w:numPr>
+        <w:spacing w:after="60" w:line="270"/>
+      </w:pPr>
+      <w:r>
+        <w:rPr>
+          <w:b/>
+          <w:bCs/>
+        </w:rPr>
+        <w:t xml:space="preserve">Sellers. </w:t>
+      </w:r>
+      <w:r>
+        <w:t xml:space="preserve">BeyondGorgeous is seeded as the house seller; third-party sellers are added as rows later.</w:t>
+      </w:r>
+    </w:p>
+    <w:p>
+      <w:pPr>
+        <w:pStyle w:val="ListParagraph"/>
+        <w:numPr>
+          <w:ilvl w:val="0"/>
+          <w:numId w:val="2"/>
+        </w:numPr>
+        <w:spacing w:after="60" w:line="270"/>
+      </w:pPr>
+      <w:r>
+        <w:rPr>
+          <w:b/>
+          <w:bCs/>
+        </w:rPr>
+        <w:t xml:space="preserve">Listings (offers). </w:t>
+      </w:r>
+      <w:r>
+        <w:t xml:space="preserve">A seller’s price, stock, and fulfilment on a variant. At launch: one seller, one listing per variant.</w:t>
+      </w:r>
+    </w:p>
+    <w:p>
+      <w:pPr>
+        <w:pStyle w:val="ListParagraph"/>
+        <w:numPr>
+          <w:ilvl w:val="0"/>
+          <w:numId w:val="2"/>
+        </w:numPr>
+        <w:spacing w:after="60" w:line="270"/>
+      </w:pPr>
+      <w:r>
+        <w:rPr>
+          <w:b/>
+          <w:bCs/>
+        </w:rPr>
+        <w:t xml:space="preserve">Cart &amp; orders reference listings, </w:t>
+      </w:r>
+      <w:r>
+        <w:t xml:space="preserve">so they already carry seller, price, and fulfilment — multi-seller becomes additive.</w:t>
+      </w:r>
+    </w:p>
+    <w:p>
+      <w:pPr>
+        <w:pStyle w:val="ListParagraph"/>
+        <w:numPr>
+          <w:ilvl w:val="0"/>
+          <w:numId w:val="2"/>
+        </w:numPr>
+        <w:spacing w:after="60" w:line="270"/>
+      </w:pPr>
+      <w:r>
+        <w:rPr>
+          <w:b/>
+          <w:bCs/>
+        </w:rPr>
+        <w:t xml:space="preserve">Payments. </w:t>
+      </w:r>
+      <w:r>
+        <w:t xml:space="preserve">Choose a gateway with marketplace split-settlement (Razorpay Route) so future payouts need no re-integration.</w:t>
+      </w:r>
+    </w:p>
+    <w:p>
+      <w:pPr>
+        <w:spacing w:after="120" w:line="276"/>
+      </w:pPr>
+      <w:r>
+        <w:rPr>
+          <w:b/>
+          <w:bCs/>
+        </w:rPr>
+        <w:t xml:space="preserve">Unblocked for later (not built now): </w:t>
+      </w:r>
+      <w:r>
+        <w:t xml:space="preserve">seller onboarding &amp; portal, multi-offer buy box, commission &amp; payouts, per-seller shipping, ratings, store pages, and GST/tax.</w:t>
       </w:r>
     </w:p>
     <w:p>
@@ -5528,7 +5753,7 @@
         <w:pStyle w:val="Heading2"/>
       </w:pPr>
       <w:r>
-        <w:t xml:space="preserve">5.8 AI customer support &amp; Jira</w:t>
+        <w:t xml:space="preserve">5.8 Inventory management &amp; replenishment (ERP)</w:t>
       </w:r>
     </w:p>
     <w:p>
@@ -5536,7 +5761,293 @@
         <w:spacing w:after="120" w:line="276"/>
       </w:pPr>
       <w:r>
-        <w:t xml:space="preserve">A Claude-powered chatbot answers from three grounded sources: the product catalog, the signed-in customer’s own order data, and a curated FAQ. When it cannot resolve an issue, it automatically creates a Jira ticket containing the conversation transcript and order context, and returns a ticket reference to the customer. The bot never performs irreversible actions (refunds, cancellations) itself; those always escalate to a human.</w:t>
+        <w:t xml:space="preserve">Designed like an ERP planner, primarily for owned / self-fulfilled stock. On-hand is derived from a stock ledger of movements (receipts, sales, returns, adjustments) rather than a bare counter — giving auditability and the data for replenishment.</w:t>
+      </w:r>
+    </w:p>
+    <w:p>
+      <w:pPr>
+        <w:spacing w:after="120" w:line="276"/>
+      </w:pPr>
+      <w:r>
+        <w:t xml:space="preserve">Stock states per SKU per location: on-hand, reserved, available (= on-hand − reserved), on-order (open purchase orders), and projected (= available + on-order).</w:t>
+      </w:r>
+    </w:p>
+    <w:p>
+      <w:pPr>
+        <w:spacing w:after="120" w:line="276"/>
+      </w:pPr>
+      <w:r>
+        <w:t xml:space="preserve">Each SKU carries a reorder policy — safety stock, reorder point, reorder quantity, lead time, preferred vendor (internal or external), and a replenishment mode:</w:t>
+      </w:r>
+    </w:p>
+    <w:tbl>
+      <w:tblPr>
+        <w:tblW w:type="dxa" w:w="9360"/>
+        <w:tblBorders>
+          <w:top w:val="single" w:color="auto" w:sz="4"/>
+          <w:left w:val="single" w:color="auto" w:sz="4"/>
+          <w:bottom w:val="single" w:color="auto" w:sz="4"/>
+          <w:right w:val="single" w:color="auto" w:sz="4"/>
+          <w:insideH w:val="single" w:color="auto" w:sz="4"/>
+          <w:insideV w:val="single" w:color="auto" w:sz="4"/>
+        </w:tblBorders>
+      </w:tblPr>
+      <w:tblGrid>
+        <w:gridCol w:w="2000"/>
+        <w:gridCol w:w="7360"/>
+      </w:tblGrid>
+      <w:tr>
+        <w:trPr>
+          <w:tblHeader/>
+        </w:trPr>
+        <w:tc>
+          <w:tcPr>
+            <w:tcW w:type="dxa" w:w="2000"/>
+            <w:tcBorders>
+              <w:top w:val="single" w:color="D9D2D5" w:sz="1"/>
+              <w:left w:val="single" w:color="D9D2D5" w:sz="1"/>
+              <w:bottom w:val="single" w:color="D9D2D5" w:sz="1"/>
+              <w:right w:val="single" w:color="D9D2D5" w:sz="1"/>
+            </w:tcBorders>
+            <w:shd w:fill="FBEAF0" w:color="auto" w:val="clear"/>
+            <w:tcMar>
+              <w:top w:type="dxa" w:w="70"/>
+              <w:left w:type="dxa" w:w="110"/>
+              <w:bottom w:type="dxa" w:w="70"/>
+              <w:right w:type="dxa" w:w="110"/>
+            </w:tcMar>
+            <w:vAlign w:val="center"/>
+          </w:tcPr>
+          <w:p>
+            <w:r>
+              <w:rPr>
+                <w:b/>
+                <w:bCs/>
+                <w:color w:val="4B1528"/>
+                <w:sz w:val="19"/>
+                <w:szCs w:val="19"/>
+              </w:rPr>
+              <w:t xml:space="preserve">Mode</w:t>
+            </w:r>
+          </w:p>
+        </w:tc>
+        <w:tc>
+          <w:tcPr>
+            <w:tcW w:type="dxa" w:w="7360"/>
+            <w:tcBorders>
+              <w:top w:val="single" w:color="D9D2D5" w:sz="1"/>
+              <w:left w:val="single" w:color="D9D2D5" w:sz="1"/>
+              <w:bottom w:val="single" w:color="D9D2D5" w:sz="1"/>
+              <w:right w:val="single" w:color="D9D2D5" w:sz="1"/>
+            </w:tcBorders>
+            <w:shd w:fill="FBEAF0" w:color="auto" w:val="clear"/>
+            <w:tcMar>
+              <w:top w:type="dxa" w:w="70"/>
+              <w:left w:type="dxa" w:w="110"/>
+              <w:bottom w:type="dxa" w:w="70"/>
+              <w:right w:type="dxa" w:w="110"/>
+            </w:tcMar>
+            <w:vAlign w:val="center"/>
+          </w:tcPr>
+          <w:p>
+            <w:r>
+              <w:rPr>
+                <w:b/>
+                <w:bCs/>
+                <w:color w:val="4B1528"/>
+                <w:sz w:val="19"/>
+                <w:szCs w:val="19"/>
+              </w:rPr>
+              <w:t xml:space="preserve">Action when available stock ≤ reorder point</w:t>
+            </w:r>
+          </w:p>
+        </w:tc>
+      </w:tr>
+      <w:tr>
+        <w:tc>
+          <w:tcPr>
+            <w:tcW w:type="dxa" w:w="2000"/>
+            <w:tcBorders>
+              <w:top w:val="single" w:color="D9D2D5" w:sz="1"/>
+              <w:left w:val="single" w:color="D9D2D5" w:sz="1"/>
+              <w:bottom w:val="single" w:color="D9D2D5" w:sz="1"/>
+              <w:right w:val="single" w:color="D9D2D5" w:sz="1"/>
+            </w:tcBorders>
+            <w:tcMar>
+              <w:top w:type="dxa" w:w="70"/>
+              <w:left w:type="dxa" w:w="110"/>
+              <w:bottom w:type="dxa" w:w="70"/>
+              <w:right w:type="dxa" w:w="110"/>
+            </w:tcMar>
+            <w:vAlign w:val="center"/>
+          </w:tcPr>
+          <w:p>
+            <w:r>
+              <w:rPr>
+                <w:sz w:val="19"/>
+                <w:szCs w:val="19"/>
+              </w:rPr>
+              <w:t xml:space="preserve">auto_po</w:t>
+            </w:r>
+          </w:p>
+        </w:tc>
+        <w:tc>
+          <w:tcPr>
+            <w:tcW w:type="dxa" w:w="7360"/>
+            <w:tcBorders>
+              <w:top w:val="single" w:color="D9D2D5" w:sz="1"/>
+              <w:left w:val="single" w:color="D9D2D5" w:sz="1"/>
+              <w:bottom w:val="single" w:color="D9D2D5" w:sz="1"/>
+              <w:right w:val="single" w:color="D9D2D5" w:sz="1"/>
+            </w:tcBorders>
+            <w:tcMar>
+              <w:top w:type="dxa" w:w="70"/>
+              <w:left w:type="dxa" w:w="110"/>
+              <w:bottom w:type="dxa" w:w="70"/>
+              <w:right w:type="dxa" w:w="110"/>
+            </w:tcMar>
+            <w:vAlign w:val="center"/>
+          </w:tcPr>
+          <w:p>
+            <w:r>
+              <w:rPr>
+                <w:sz w:val="19"/>
+                <w:szCs w:val="19"/>
+              </w:rPr>
+              <w:t xml:space="preserve">Create and send a Purchase Order to the preferred vendor automatically</w:t>
+            </w:r>
+          </w:p>
+        </w:tc>
+      </w:tr>
+      <w:tr>
+        <w:tc>
+          <w:tcPr>
+            <w:tcW w:type="dxa" w:w="2000"/>
+            <w:tcBorders>
+              <w:top w:val="single" w:color="D9D2D5" w:sz="1"/>
+              <w:left w:val="single" w:color="D9D2D5" w:sz="1"/>
+              <w:bottom w:val="single" w:color="D9D2D5" w:sz="1"/>
+              <w:right w:val="single" w:color="D9D2D5" w:sz="1"/>
+            </w:tcBorders>
+            <w:shd w:fill="FAF5F7" w:color="auto" w:val="clear"/>
+            <w:tcMar>
+              <w:top w:type="dxa" w:w="70"/>
+              <w:left w:type="dxa" w:w="110"/>
+              <w:bottom w:type="dxa" w:w="70"/>
+              <w:right w:type="dxa" w:w="110"/>
+            </w:tcMar>
+            <w:vAlign w:val="center"/>
+          </w:tcPr>
+          <w:p>
+            <w:r>
+              <w:rPr>
+                <w:sz w:val="19"/>
+                <w:szCs w:val="19"/>
+              </w:rPr>
+              <w:t xml:space="preserve">approval</w:t>
+            </w:r>
+          </w:p>
+        </w:tc>
+        <w:tc>
+          <w:tcPr>
+            <w:tcW w:type="dxa" w:w="7360"/>
+            <w:tcBorders>
+              <w:top w:val="single" w:color="D9D2D5" w:sz="1"/>
+              <w:left w:val="single" w:color="D9D2D5" w:sz="1"/>
+              <w:bottom w:val="single" w:color="D9D2D5" w:sz="1"/>
+              <w:right w:val="single" w:color="D9D2D5" w:sz="1"/>
+            </w:tcBorders>
+            <w:shd w:fill="FAF5F7" w:color="auto" w:val="clear"/>
+            <w:tcMar>
+              <w:top w:type="dxa" w:w="70"/>
+              <w:left w:type="dxa" w:w="110"/>
+              <w:bottom w:type="dxa" w:w="70"/>
+              <w:right w:type="dxa" w:w="110"/>
+            </w:tcMar>
+            <w:vAlign w:val="center"/>
+          </w:tcPr>
+          <w:p>
+            <w:r>
+              <w:rPr>
+                <w:sz w:val="19"/>
+                <w:szCs w:val="19"/>
+              </w:rPr>
+              <w:t xml:space="preserve">Create a draft Purchase Order and alert for human approval</w:t>
+            </w:r>
+          </w:p>
+        </w:tc>
+      </w:tr>
+      <w:tr>
+        <w:tc>
+          <w:tcPr>
+            <w:tcW w:type="dxa" w:w="2000"/>
+            <w:tcBorders>
+              <w:top w:val="single" w:color="D9D2D5" w:sz="1"/>
+              <w:left w:val="single" w:color="D9D2D5" w:sz="1"/>
+              <w:bottom w:val="single" w:color="D9D2D5" w:sz="1"/>
+              <w:right w:val="single" w:color="D9D2D5" w:sz="1"/>
+            </w:tcBorders>
+            <w:tcMar>
+              <w:top w:type="dxa" w:w="70"/>
+              <w:left w:type="dxa" w:w="110"/>
+              <w:bottom w:type="dxa" w:w="70"/>
+              <w:right w:type="dxa" w:w="110"/>
+            </w:tcMar>
+            <w:vAlign w:val="center"/>
+          </w:tcPr>
+          <w:p>
+            <w:r>
+              <w:rPr>
+                <w:sz w:val="19"/>
+                <w:szCs w:val="19"/>
+              </w:rPr>
+              <w:t xml:space="preserve">alert_only</w:t>
+            </w:r>
+          </w:p>
+        </w:tc>
+        <w:tc>
+          <w:tcPr>
+            <w:tcW w:type="dxa" w:w="7360"/>
+            <w:tcBorders>
+              <w:top w:val="single" w:color="D9D2D5" w:sz="1"/>
+              <w:left w:val="single" w:color="D9D2D5" w:sz="1"/>
+              <w:bottom w:val="single" w:color="D9D2D5" w:sz="1"/>
+              <w:right w:val="single" w:color="D9D2D5" w:sz="1"/>
+            </w:tcBorders>
+            <w:tcMar>
+              <w:top w:type="dxa" w:w="70"/>
+              <w:left w:type="dxa" w:w="110"/>
+              <w:bottom w:type="dxa" w:w="70"/>
+              <w:right w:type="dxa" w:w="110"/>
+            </w:tcMar>
+            <w:vAlign w:val="center"/>
+          </w:tcPr>
+          <w:p>
+            <w:r>
+              <w:rPr>
+                <w:sz w:val="19"/>
+                <w:szCs w:val="19"/>
+              </w:rPr>
+              <w:t xml:space="preserve">Raise a low-stock alarm / Jira ticket; no Purchase Order</w:t>
+            </w:r>
+          </w:p>
+        </w:tc>
+      </w:tr>
+    </w:tbl>
+    <w:p>
+      <w:pPr>
+        <w:spacing w:after="80"/>
+      </w:pPr>
+      <w:r>
+        <w:t xml:space="preserve"/>
+      </w:r>
+    </w:p>
+    <w:p>
+      <w:pPr>
+        <w:spacing w:after="120" w:line="276"/>
+      </w:pPr>
+      <w:r>
+        <w:t xml:space="preserve">A replenishment engine runs on a schedule and on every stock decrement. Purchase Orders have a lifecycle (draft → sent → confirmed → received); sending one reuses the integration layer outbound (API or email to the vendor), mirroring ingestion. Goods receipt posts ledger entries. Low-stock, out-of-stock, overstock, and overdue-PO conditions raise admin alarms and optional Jira tickets. Safety stock is fixed per SKU at launch and can become statistical later using sales velocity from the ledger.</w:t>
       </w:r>
     </w:p>
     <w:p>
@@ -5544,7 +6055,39 @@
         <w:pStyle w:val="Heading2"/>
       </w:pPr>
       <w:r>
-        <w:t xml:space="preserve">5.9 API surface</w:t>
+        <w:t xml:space="preserve">5.9 SEO architecture</w:t>
+      </w:r>
+    </w:p>
+    <w:p>
+      <w:pPr>
+        <w:spacing w:after="120" w:line="276"/>
+      </w:pPr>
+      <w:r>
+        <w:t xml:space="preserve">SEO is a rendering decision, not a late add-on. All public pages are server-side rendered so Google receives complete HTML. URLs are clean and keyword-rich; slugs are stable. Each page emits a unique title, meta description, and canonical URL. Structured data (JSON-LD) for Product, BreadcrumbList, Organization, and WebSite drives rich results — price, star ratings, and breadcrumbs — in Google. An auto-generated XML sitemap and robots.txt support crawling, and the site is registered in Google Search Console. Action item carried into Phase 1: the current category page is a client component and must be rebuilt server-side for SEO.</w:t>
+      </w:r>
+    </w:p>
+    <w:p>
+      <w:pPr>
+        <w:pStyle w:val="Heading2"/>
+      </w:pPr>
+      <w:r>
+        <w:t xml:space="preserve">5.10 AI customer support &amp; Jira</w:t>
+      </w:r>
+    </w:p>
+    <w:p>
+      <w:pPr>
+        <w:spacing w:after="120" w:line="276"/>
+      </w:pPr>
+      <w:r>
+        <w:t xml:space="preserve">A Claude-powered chatbot answers from three grounded sources: the product catalog, the signed-in customer’s own order data, and a curated FAQ. When it cannot resolve an issue, it automatically creates a Jira ticket containing the conversation transcript and order context, and returns a ticket reference to the customer. The bot never performs irreversible actions (refunds, cancellations) itself; those always escalate to a human.</w:t>
+      </w:r>
+    </w:p>
+    <w:p>
+      <w:pPr>
+        <w:pStyle w:val="Heading2"/>
+      </w:pPr>
+      <w:r>
+        <w:t xml:space="preserve">5.11 API surface</w:t>
       </w:r>
     </w:p>
     <w:tbl>
@@ -6258,7 +6801,7 @@
         <w:pStyle w:val="Heading2"/>
       </w:pPr>
       <w:r>
-        <w:t xml:space="preserve">5.10 Technology stack</w:t>
+        <w:t xml:space="preserve">5.12 Technology stack</w:t>
       </w:r>
     </w:p>
     <w:tbl>
@@ -6909,7 +7452,7 @@
                 <w:sz w:val="19"/>
                 <w:szCs w:val="19"/>
               </w:rPr>
-              <w:t xml:space="preserve">Razorpay (proposed)</w:t>
+              <w:t xml:space="preserve">Razorpay + Route (proposed; marketplace split-ready)</w:t>
             </w:r>
           </w:p>
         </w:tc>
@@ -7532,7 +8075,7 @@
         <w:spacing w:after="120" w:line="276"/>
       </w:pPr>
       <w:r>
-        <w:t xml:space="preserve">Five sequential phases. Durations are indicative build estimates for an assistant-led build with the founder as product owner; they depend on review cycles and vendor readiness. The schema is built vendor- and fulfillment-ready in Phase 1, so later phases add capability without reworking the catalog.</w:t>
+        <w:t xml:space="preserve">Five core phases to a sellable store, then two future expansion tracks (inventory/ERP and marketplace) that the Phase 1 foundation already supports. Durations are indicative for an assistant-led build with the founder as product owner; they depend on review cycles and external onboarding. The schema is built seller-, fulfillment- and inventory-ready in Phase 1, so later phases add capability without reworking the catalog.</w:t>
       </w:r>
     </w:p>
     <w:p>
@@ -8248,6 +8791,230 @@
           </w:p>
         </w:tc>
       </w:tr>
+      <w:tr>
+        <w:tc>
+          <w:tcPr>
+            <w:tcW w:type="dxa" w:w="2700"/>
+            <w:tcBorders>
+              <w:top w:val="single" w:color="D9D2D5" w:sz="1"/>
+              <w:left w:val="single" w:color="D9D2D5" w:sz="1"/>
+              <w:bottom w:val="single" w:color="D9D2D5" w:sz="1"/>
+              <w:right w:val="single" w:color="D9D2D5" w:sz="1"/>
+            </w:tcBorders>
+            <w:shd w:fill="FAF5F7" w:color="auto" w:val="clear"/>
+            <w:tcMar>
+              <w:top w:type="dxa" w:w="70"/>
+              <w:left w:type="dxa" w:w="110"/>
+              <w:bottom w:type="dxa" w:w="70"/>
+              <w:right w:type="dxa" w:w="110"/>
+            </w:tcMar>
+            <w:vAlign w:val="center"/>
+          </w:tcPr>
+          <w:p>
+            <w:r>
+              <w:rPr>
+                <w:sz w:val="19"/>
+                <w:szCs w:val="19"/>
+              </w:rPr>
+              <w:t xml:space="preserve">6. Inventory &amp; replenishment (ERP)</w:t>
+            </w:r>
+          </w:p>
+        </w:tc>
+        <w:tc>
+          <w:tcPr>
+            <w:tcW w:type="dxa" w:w="3360"/>
+            <w:tcBorders>
+              <w:top w:val="single" w:color="D9D2D5" w:sz="1"/>
+              <w:left w:val="single" w:color="D9D2D5" w:sz="1"/>
+              <w:bottom w:val="single" w:color="D9D2D5" w:sz="1"/>
+              <w:right w:val="single" w:color="D9D2D5" w:sz="1"/>
+            </w:tcBorders>
+            <w:shd w:fill="FAF5F7" w:color="auto" w:val="clear"/>
+            <w:tcMar>
+              <w:top w:type="dxa" w:w="70"/>
+              <w:left w:type="dxa" w:w="110"/>
+              <w:bottom w:type="dxa" w:w="70"/>
+              <w:right w:type="dxa" w:w="110"/>
+            </w:tcMar>
+            <w:vAlign w:val="center"/>
+          </w:tcPr>
+          <w:p>
+            <w:r>
+              <w:rPr>
+                <w:sz w:val="19"/>
+                <w:szCs w:val="19"/>
+              </w:rPr>
+              <w:t xml:space="preserve">Stock ledger, reorder policies, auto-PO/approval/alert</w:t>
+            </w:r>
+          </w:p>
+        </w:tc>
+        <w:tc>
+          <w:tcPr>
+            <w:tcW w:type="dxa" w:w="1700"/>
+            <w:tcBorders>
+              <w:top w:val="single" w:color="D9D2D5" w:sz="1"/>
+              <w:left w:val="single" w:color="D9D2D5" w:sz="1"/>
+              <w:bottom w:val="single" w:color="D9D2D5" w:sz="1"/>
+              <w:right w:val="single" w:color="D9D2D5" w:sz="1"/>
+            </w:tcBorders>
+            <w:shd w:fill="FAF5F7" w:color="auto" w:val="clear"/>
+            <w:tcMar>
+              <w:top w:type="dxa" w:w="70"/>
+              <w:left w:type="dxa" w:w="110"/>
+              <w:bottom w:type="dxa" w:w="70"/>
+              <w:right w:type="dxa" w:w="110"/>
+            </w:tcMar>
+            <w:vAlign w:val="center"/>
+          </w:tcPr>
+          <w:p>
+            <w:r>
+              <w:rPr>
+                <w:sz w:val="19"/>
+                <w:szCs w:val="19"/>
+              </w:rPr>
+              <w:t xml:space="preserve">2–3 weeks</w:t>
+            </w:r>
+          </w:p>
+        </w:tc>
+        <w:tc>
+          <w:tcPr>
+            <w:tcW w:type="dxa" w:w="1600"/>
+            <w:tcBorders>
+              <w:top w:val="single" w:color="D9D2D5" w:sz="1"/>
+              <w:left w:val="single" w:color="D9D2D5" w:sz="1"/>
+              <w:bottom w:val="single" w:color="D9D2D5" w:sz="1"/>
+              <w:right w:val="single" w:color="D9D2D5" w:sz="1"/>
+            </w:tcBorders>
+            <w:shd w:fill="FAF5F7" w:color="auto" w:val="clear"/>
+            <w:tcMar>
+              <w:top w:type="dxa" w:w="70"/>
+              <w:left w:type="dxa" w:w="110"/>
+              <w:bottom w:type="dxa" w:w="70"/>
+              <w:right w:type="dxa" w:w="110"/>
+            </w:tcMar>
+            <w:vAlign w:val="center"/>
+          </w:tcPr>
+          <w:p>
+            <w:r>
+              <w:rPr>
+                <w:sz w:val="19"/>
+                <w:szCs w:val="19"/>
+              </w:rPr>
+              <w:t xml:space="preserve">Phase 4</w:t>
+            </w:r>
+          </w:p>
+        </w:tc>
+      </w:tr>
+      <w:tr>
+        <w:tc>
+          <w:tcPr>
+            <w:tcW w:type="dxa" w:w="2700"/>
+            <w:tcBorders>
+              <w:top w:val="single" w:color="D9D2D5" w:sz="1"/>
+              <w:left w:val="single" w:color="D9D2D5" w:sz="1"/>
+              <w:bottom w:val="single" w:color="D9D2D5" w:sz="1"/>
+              <w:right w:val="single" w:color="D9D2D5" w:sz="1"/>
+            </w:tcBorders>
+            <w:tcMar>
+              <w:top w:type="dxa" w:w="70"/>
+              <w:left w:type="dxa" w:w="110"/>
+              <w:bottom w:type="dxa" w:w="70"/>
+              <w:right w:type="dxa" w:w="110"/>
+            </w:tcMar>
+            <w:vAlign w:val="center"/>
+          </w:tcPr>
+          <w:p>
+            <w:r>
+              <w:rPr>
+                <w:sz w:val="19"/>
+                <w:szCs w:val="19"/>
+              </w:rPr>
+              <w:t xml:space="preserve">7. Marketplace enablement (future)</w:t>
+            </w:r>
+          </w:p>
+        </w:tc>
+        <w:tc>
+          <w:tcPr>
+            <w:tcW w:type="dxa" w:w="3360"/>
+            <w:tcBorders>
+              <w:top w:val="single" w:color="D9D2D5" w:sz="1"/>
+              <w:left w:val="single" w:color="D9D2D5" w:sz="1"/>
+              <w:bottom w:val="single" w:color="D9D2D5" w:sz="1"/>
+              <w:right w:val="single" w:color="D9D2D5" w:sz="1"/>
+            </w:tcBorders>
+            <w:tcMar>
+              <w:top w:type="dxa" w:w="70"/>
+              <w:left w:type="dxa" w:w="110"/>
+              <w:bottom w:type="dxa" w:w="70"/>
+              <w:right w:type="dxa" w:w="110"/>
+            </w:tcMar>
+            <w:vAlign w:val="center"/>
+          </w:tcPr>
+          <w:p>
+            <w:r>
+              <w:rPr>
+                <w:sz w:val="19"/>
+                <w:szCs w:val="19"/>
+              </w:rPr>
+              <w:t xml:space="preserve">Seller portal, buy box, commission &amp; payouts</w:t>
+            </w:r>
+          </w:p>
+        </w:tc>
+        <w:tc>
+          <w:tcPr>
+            <w:tcW w:type="dxa" w:w="1700"/>
+            <w:tcBorders>
+              <w:top w:val="single" w:color="D9D2D5" w:sz="1"/>
+              <w:left w:val="single" w:color="D9D2D5" w:sz="1"/>
+              <w:bottom w:val="single" w:color="D9D2D5" w:sz="1"/>
+              <w:right w:val="single" w:color="D9D2D5" w:sz="1"/>
+            </w:tcBorders>
+            <w:tcMar>
+              <w:top w:type="dxa" w:w="70"/>
+              <w:left w:type="dxa" w:w="110"/>
+              <w:bottom w:type="dxa" w:w="70"/>
+              <w:right w:type="dxa" w:w="110"/>
+            </w:tcMar>
+            <w:vAlign w:val="center"/>
+          </w:tcPr>
+          <w:p>
+            <w:r>
+              <w:rPr>
+                <w:sz w:val="19"/>
+                <w:szCs w:val="19"/>
+              </w:rPr>
+              <w:t xml:space="preserve">Future track</w:t>
+            </w:r>
+          </w:p>
+        </w:tc>
+        <w:tc>
+          <w:tcPr>
+            <w:tcW w:type="dxa" w:w="1600"/>
+            <w:tcBorders>
+              <w:top w:val="single" w:color="D9D2D5" w:sz="1"/>
+              <w:left w:val="single" w:color="D9D2D5" w:sz="1"/>
+              <w:bottom w:val="single" w:color="D9D2D5" w:sz="1"/>
+              <w:right w:val="single" w:color="D9D2D5" w:sz="1"/>
+            </w:tcBorders>
+            <w:tcMar>
+              <w:top w:type="dxa" w:w="70"/>
+              <w:left w:type="dxa" w:w="110"/>
+              <w:bottom w:type="dxa" w:w="70"/>
+              <w:right w:type="dxa" w:w="110"/>
+            </w:tcMar>
+            <w:vAlign w:val="center"/>
+          </w:tcPr>
+          <w:p>
+            <w:r>
+              <w:rPr>
+                <w:sz w:val="19"/>
+                <w:szCs w:val="19"/>
+              </w:rPr>
+              <w:t xml:space="preserve">Phases 3–6</w:t>
+            </w:r>
+          </w:p>
+        </w:tc>
+      </w:tr>
     </w:tbl>
     <w:p>
       <w:pPr>
@@ -8564,6 +9331,127 @@
       </w:r>
       <w:r>
         <w:t xml:space="preserve">common queries are answered automatically; complex issues create a Jira ticket.</w:t>
+      </w:r>
+    </w:p>
+    <w:p>
+      <w:pPr>
+        <w:pStyle w:val="Heading3"/>
+      </w:pPr>
+      <w:r>
+        <w:t xml:space="preserve">Phase 6 — Inventory &amp; replenishment (ERP)</w:t>
+      </w:r>
+    </w:p>
+    <w:p>
+      <w:pPr>
+        <w:pStyle w:val="ListParagraph"/>
+        <w:numPr>
+          <w:ilvl w:val="0"/>
+          <w:numId w:val="2"/>
+        </w:numPr>
+        <w:spacing w:after="60" w:line="270"/>
+      </w:pPr>
+      <w:r>
+        <w:t xml:space="preserve">Stock ledger and derived on-hand/available; reorder policies with safety stock and reorder points.</w:t>
+      </w:r>
+    </w:p>
+    <w:p>
+      <w:pPr>
+        <w:pStyle w:val="ListParagraph"/>
+        <w:numPr>
+          <w:ilvl w:val="0"/>
+          <w:numId w:val="2"/>
+        </w:numPr>
+        <w:spacing w:after="60" w:line="270"/>
+      </w:pPr>
+      <w:r>
+        <w:t xml:space="preserve">Replenishment engine with three modes per SKU: auto-PO, draft-for-approval, or alert-only.</w:t>
+      </w:r>
+    </w:p>
+    <w:p>
+      <w:pPr>
+        <w:pStyle w:val="ListParagraph"/>
+        <w:numPr>
+          <w:ilvl w:val="0"/>
+          <w:numId w:val="2"/>
+        </w:numPr>
+        <w:spacing w:after="60" w:line="270"/>
+      </w:pPr>
+      <w:r>
+        <w:t xml:space="preserve">Purchase orders (sent via API or email), goods receipt, and low-stock alarms / Jira tickets.</w:t>
+      </w:r>
+    </w:p>
+    <w:p>
+      <w:pPr>
+        <w:pStyle w:val="ListParagraph"/>
+        <w:numPr>
+          <w:ilvl w:val="0"/>
+          <w:numId w:val="2"/>
+        </w:numPr>
+        <w:spacing w:after="60" w:line="270"/>
+      </w:pPr>
+      <w:r>
+        <w:rPr>
+          <w:b/>
+          <w:bCs/>
+        </w:rPr>
+        <w:t xml:space="preserve">Exit criteria: </w:t>
+      </w:r>
+      <w:r>
+        <w:t xml:space="preserve">a SKU falling below its reorder point automatically triggers its configured action.</w:t>
+      </w:r>
+    </w:p>
+    <w:p>
+      <w:pPr>
+        <w:pStyle w:val="Heading3"/>
+      </w:pPr>
+      <w:r>
+        <w:t xml:space="preserve">Phase 7 — Marketplace enablement (future)</w:t>
+      </w:r>
+    </w:p>
+    <w:p>
+      <w:pPr>
+        <w:pStyle w:val="ListParagraph"/>
+        <w:numPr>
+          <w:ilvl w:val="0"/>
+          <w:numId w:val="2"/>
+        </w:numPr>
+        <w:spacing w:after="60" w:line="270"/>
+      </w:pPr>
+      <w:r>
+        <w:t xml:space="preserve">Seller onboarding &amp; portal; multi-offer buy box; commission and automated payouts (Razorpay Route).</w:t>
+      </w:r>
+    </w:p>
+    <w:p>
+      <w:pPr>
+        <w:pStyle w:val="ListParagraph"/>
+        <w:numPr>
+          <w:ilvl w:val="0"/>
+          <w:numId w:val="2"/>
+        </w:numPr>
+        <w:spacing w:after="60" w:line="270"/>
+      </w:pPr>
+      <w:r>
+        <w:t xml:space="preserve">Per-seller shipping, ratings, store pages, and GST/tax.</w:t>
+      </w:r>
+    </w:p>
+    <w:p>
+      <w:pPr>
+        <w:pStyle w:val="ListParagraph"/>
+        <w:numPr>
+          <w:ilvl w:val="0"/>
+          <w:numId w:val="2"/>
+        </w:numPr>
+        <w:spacing w:after="60" w:line="270"/>
+      </w:pPr>
+      <w:r>
+        <w:rPr>
+          <w:b/>
+          <w:bCs/>
+        </w:rPr>
+        <w:t xml:space="preserve">Exit criteria: </w:t>
+      </w:r>
+      <w:r>
+        <w:t xml:space="preserve">a third-party seller can list, sell, and be paid out — with no change to the core catalog schema.</w:t>
       </w:r>
     </w:p>
     <w:p>
@@ -11591,7 +12479,7 @@
                 <w:sz w:val="19"/>
                 <w:szCs w:val="19"/>
               </w:rPr>
-              <w:t xml:space="preserve">Full vendor/fulfillment-ready from day one</w:t>
+              <w:t xml:space="preserve">Full seller/fulfillment/inventory-ready from day one</w:t>
             </w:r>
           </w:p>
         </w:tc>
@@ -11761,6 +12649,230 @@
                 <w:sz w:val="19"/>
                 <w:szCs w:val="19"/>
               </w:rPr>
+              <w:t xml:space="preserve">Product/listing separation</w:t>
+            </w:r>
+          </w:p>
+        </w:tc>
+        <w:tc>
+          <w:tcPr>
+            <w:tcW w:type="dxa" w:w="1560"/>
+            <w:tcBorders>
+              <w:top w:val="single" w:color="D9D2D5" w:sz="1"/>
+              <w:left w:val="single" w:color="D9D2D5" w:sz="1"/>
+              <w:bottom w:val="single" w:color="D9D2D5" w:sz="1"/>
+              <w:right w:val="single" w:color="D9D2D5" w:sz="1"/>
+            </w:tcBorders>
+            <w:tcMar>
+              <w:top w:type="dxa" w:w="70"/>
+              <w:left w:type="dxa" w:w="110"/>
+              <w:bottom w:type="dxa" w:w="70"/>
+              <w:right w:type="dxa" w:w="110"/>
+            </w:tcMar>
+            <w:vAlign w:val="center"/>
+          </w:tcPr>
+          <w:p>
+            <w:r>
+              <w:rPr>
+                <w:sz w:val="19"/>
+                <w:szCs w:val="19"/>
+              </w:rPr>
+              <w:t xml:space="preserve">Default</w:t>
+            </w:r>
+          </w:p>
+        </w:tc>
+        <w:tc>
+          <w:tcPr>
+            <w:tcW w:type="dxa" w:w="3800"/>
+            <w:tcBorders>
+              <w:top w:val="single" w:color="D9D2D5" w:sz="1"/>
+              <w:left w:val="single" w:color="D9D2D5" w:sz="1"/>
+              <w:bottom w:val="single" w:color="D9D2D5" w:sz="1"/>
+              <w:right w:val="single" w:color="D9D2D5" w:sz="1"/>
+            </w:tcBorders>
+            <w:tcMar>
+              <w:top w:type="dxa" w:w="70"/>
+              <w:left w:type="dxa" w:w="110"/>
+              <w:bottom w:type="dxa" w:w="70"/>
+              <w:right w:type="dxa" w:w="110"/>
+            </w:tcMar>
+            <w:vAlign w:val="center"/>
+          </w:tcPr>
+          <w:p>
+            <w:r>
+              <w:rPr>
+                <w:sz w:val="19"/>
+                <w:szCs w:val="19"/>
+              </w:rPr>
+              <w:t xml:space="preserve">Adopt now; cart/orders reference listings</w:t>
+            </w:r>
+          </w:p>
+        </w:tc>
+      </w:tr>
+      <w:tr>
+        <w:tc>
+          <w:tcPr>
+            <w:tcW w:type="dxa" w:w="600"/>
+            <w:tcBorders>
+              <w:top w:val="single" w:color="D9D2D5" w:sz="1"/>
+              <w:left w:val="single" w:color="D9D2D5" w:sz="1"/>
+              <w:bottom w:val="single" w:color="D9D2D5" w:sz="1"/>
+              <w:right w:val="single" w:color="D9D2D5" w:sz="1"/>
+            </w:tcBorders>
+            <w:shd w:fill="FAF5F7" w:color="auto" w:val="clear"/>
+            <w:tcMar>
+              <w:top w:type="dxa" w:w="70"/>
+              <w:left w:type="dxa" w:w="110"/>
+              <w:bottom w:type="dxa" w:w="70"/>
+              <w:right w:type="dxa" w:w="110"/>
+            </w:tcMar>
+            <w:vAlign w:val="center"/>
+          </w:tcPr>
+          <w:p>
+            <w:r>
+              <w:rPr>
+                <w:sz w:val="19"/>
+                <w:szCs w:val="19"/>
+              </w:rPr>
+              <w:t xml:space="preserve">4</w:t>
+            </w:r>
+          </w:p>
+        </w:tc>
+        <w:tc>
+          <w:tcPr>
+            <w:tcW w:type="dxa" w:w="3400"/>
+            <w:tcBorders>
+              <w:top w:val="single" w:color="D9D2D5" w:sz="1"/>
+              <w:left w:val="single" w:color="D9D2D5" w:sz="1"/>
+              <w:bottom w:val="single" w:color="D9D2D5" w:sz="1"/>
+              <w:right w:val="single" w:color="D9D2D5" w:sz="1"/>
+            </w:tcBorders>
+            <w:shd w:fill="FAF5F7" w:color="auto" w:val="clear"/>
+            <w:tcMar>
+              <w:top w:type="dxa" w:w="70"/>
+              <w:left w:type="dxa" w:w="110"/>
+              <w:bottom w:type="dxa" w:w="70"/>
+              <w:right w:type="dxa" w:w="110"/>
+            </w:tcMar>
+            <w:vAlign w:val="center"/>
+          </w:tcPr>
+          <w:p>
+            <w:r>
+              <w:rPr>
+                <w:sz w:val="19"/>
+                <w:szCs w:val="19"/>
+              </w:rPr>
+              <w:t xml:space="preserve">Inventory model</w:t>
+            </w:r>
+          </w:p>
+        </w:tc>
+        <w:tc>
+          <w:tcPr>
+            <w:tcW w:type="dxa" w:w="1560"/>
+            <w:tcBorders>
+              <w:top w:val="single" w:color="D9D2D5" w:sz="1"/>
+              <w:left w:val="single" w:color="D9D2D5" w:sz="1"/>
+              <w:bottom w:val="single" w:color="D9D2D5" w:sz="1"/>
+              <w:right w:val="single" w:color="D9D2D5" w:sz="1"/>
+            </w:tcBorders>
+            <w:shd w:fill="FAF5F7" w:color="auto" w:val="clear"/>
+            <w:tcMar>
+              <w:top w:type="dxa" w:w="70"/>
+              <w:left w:type="dxa" w:w="110"/>
+              <w:bottom w:type="dxa" w:w="70"/>
+              <w:right w:type="dxa" w:w="110"/>
+            </w:tcMar>
+            <w:vAlign w:val="center"/>
+          </w:tcPr>
+          <w:p>
+            <w:r>
+              <w:rPr>
+                <w:sz w:val="19"/>
+                <w:szCs w:val="19"/>
+              </w:rPr>
+              <w:t xml:space="preserve">Default</w:t>
+            </w:r>
+          </w:p>
+        </w:tc>
+        <w:tc>
+          <w:tcPr>
+            <w:tcW w:type="dxa" w:w="3800"/>
+            <w:tcBorders>
+              <w:top w:val="single" w:color="D9D2D5" w:sz="1"/>
+              <w:left w:val="single" w:color="D9D2D5" w:sz="1"/>
+              <w:bottom w:val="single" w:color="D9D2D5" w:sz="1"/>
+              <w:right w:val="single" w:color="D9D2D5" w:sz="1"/>
+            </w:tcBorders>
+            <w:shd w:fill="FAF5F7" w:color="auto" w:val="clear"/>
+            <w:tcMar>
+              <w:top w:type="dxa" w:w="70"/>
+              <w:left w:type="dxa" w:w="110"/>
+              <w:bottom w:type="dxa" w:w="70"/>
+              <w:right w:type="dxa" w:w="110"/>
+            </w:tcMar>
+            <w:vAlign w:val="center"/>
+          </w:tcPr>
+          <w:p>
+            <w:r>
+              <w:rPr>
+                <w:sz w:val="19"/>
+                <w:szCs w:val="19"/>
+              </w:rPr>
+              <w:t xml:space="preserve">Stock ledger (derived on-hand)</w:t>
+            </w:r>
+          </w:p>
+        </w:tc>
+      </w:tr>
+      <w:tr>
+        <w:tc>
+          <w:tcPr>
+            <w:tcW w:type="dxa" w:w="600"/>
+            <w:tcBorders>
+              <w:top w:val="single" w:color="D9D2D5" w:sz="1"/>
+              <w:left w:val="single" w:color="D9D2D5" w:sz="1"/>
+              <w:bottom w:val="single" w:color="D9D2D5" w:sz="1"/>
+              <w:right w:val="single" w:color="D9D2D5" w:sz="1"/>
+            </w:tcBorders>
+            <w:tcMar>
+              <w:top w:type="dxa" w:w="70"/>
+              <w:left w:type="dxa" w:w="110"/>
+              <w:bottom w:type="dxa" w:w="70"/>
+              <w:right w:type="dxa" w:w="110"/>
+            </w:tcMar>
+            <w:vAlign w:val="center"/>
+          </w:tcPr>
+          <w:p>
+            <w:r>
+              <w:rPr>
+                <w:sz w:val="19"/>
+                <w:szCs w:val="19"/>
+              </w:rPr>
+              <w:t xml:space="preserve">5</w:t>
+            </w:r>
+          </w:p>
+        </w:tc>
+        <w:tc>
+          <w:tcPr>
+            <w:tcW w:type="dxa" w:w="3400"/>
+            <w:tcBorders>
+              <w:top w:val="single" w:color="D9D2D5" w:sz="1"/>
+              <w:left w:val="single" w:color="D9D2D5" w:sz="1"/>
+              <w:bottom w:val="single" w:color="D9D2D5" w:sz="1"/>
+              <w:right w:val="single" w:color="D9D2D5" w:sz="1"/>
+            </w:tcBorders>
+            <w:tcMar>
+              <w:top w:type="dxa" w:w="70"/>
+              <w:left w:type="dxa" w:w="110"/>
+              <w:bottom w:type="dxa" w:w="70"/>
+              <w:right w:type="dxa" w:w="110"/>
+            </w:tcMar>
+            <w:vAlign w:val="center"/>
+          </w:tcPr>
+          <w:p>
+            <w:r>
+              <w:rPr>
+                <w:sz w:val="19"/>
+                <w:szCs w:val="19"/>
+              </w:rPr>
               <w:t xml:space="preserve">Payment gateway</w:t>
             </w:r>
           </w:p>
@@ -11815,7 +12927,7 @@
                 <w:sz w:val="19"/>
                 <w:szCs w:val="19"/>
               </w:rPr>
-              <w:t xml:space="preserve">Razorpay (India-first)</w:t>
+              <w:t xml:space="preserve">Razorpay, with Route for marketplace split</w:t>
             </w:r>
           </w:p>
         </w:tc>
@@ -11845,7 +12957,7 @@
                 <w:sz w:val="19"/>
                 <w:szCs w:val="19"/>
               </w:rPr>
-              <w:t xml:space="preserve">4</w:t>
+              <w:t xml:space="preserve">6</w:t>
             </w:r>
           </w:p>
         </w:tc>
@@ -11873,7 +12985,7 @@
                 <w:sz w:val="19"/>
                 <w:szCs w:val="19"/>
               </w:rPr>
-              <w:t xml:space="preserve">Shipping for self-fulfilled</w:t>
+              <w:t xml:space="preserve">Shipping (self-fulfilled)</w:t>
             </w:r>
           </w:p>
         </w:tc>
@@ -11958,7 +13070,7 @@
                 <w:sz w:val="19"/>
                 <w:szCs w:val="19"/>
               </w:rPr>
-              <w:t xml:space="preserve">5</w:t>
+              <w:t xml:space="preserve">7</w:t>
             </w:r>
           </w:p>
         </w:tc>
@@ -11985,6 +13097,230 @@
                 <w:sz w:val="19"/>
                 <w:szCs w:val="19"/>
               </w:rPr>
+              <w:t xml:space="preserve">Replenishment default mode</w:t>
+            </w:r>
+          </w:p>
+        </w:tc>
+        <w:tc>
+          <w:tcPr>
+            <w:tcW w:type="dxa" w:w="1560"/>
+            <w:tcBorders>
+              <w:top w:val="single" w:color="D9D2D5" w:sz="1"/>
+              <w:left w:val="single" w:color="D9D2D5" w:sz="1"/>
+              <w:bottom w:val="single" w:color="D9D2D5" w:sz="1"/>
+              <w:right w:val="single" w:color="D9D2D5" w:sz="1"/>
+            </w:tcBorders>
+            <w:tcMar>
+              <w:top w:type="dxa" w:w="70"/>
+              <w:left w:type="dxa" w:w="110"/>
+              <w:bottom w:type="dxa" w:w="70"/>
+              <w:right w:type="dxa" w:w="110"/>
+            </w:tcMar>
+            <w:vAlign w:val="center"/>
+          </w:tcPr>
+          <w:p>
+            <w:r>
+              <w:rPr>
+                <w:sz w:val="19"/>
+                <w:szCs w:val="19"/>
+              </w:rPr>
+              <w:t xml:space="preserve">Default</w:t>
+            </w:r>
+          </w:p>
+        </w:tc>
+        <w:tc>
+          <w:tcPr>
+            <w:tcW w:type="dxa" w:w="3800"/>
+            <w:tcBorders>
+              <w:top w:val="single" w:color="D9D2D5" w:sz="1"/>
+              <w:left w:val="single" w:color="D9D2D5" w:sz="1"/>
+              <w:bottom w:val="single" w:color="D9D2D5" w:sz="1"/>
+              <w:right w:val="single" w:color="D9D2D5" w:sz="1"/>
+            </w:tcBorders>
+            <w:tcMar>
+              <w:top w:type="dxa" w:w="70"/>
+              <w:left w:type="dxa" w:w="110"/>
+              <w:bottom w:type="dxa" w:w="70"/>
+              <w:right w:type="dxa" w:w="110"/>
+            </w:tcMar>
+            <w:vAlign w:val="center"/>
+          </w:tcPr>
+          <w:p>
+            <w:r>
+              <w:rPr>
+                <w:sz w:val="19"/>
+                <w:szCs w:val="19"/>
+              </w:rPr>
+              <w:t xml:space="preserve">alert_only/approval at launch; auto_po opt-in</w:t>
+            </w:r>
+          </w:p>
+        </w:tc>
+      </w:tr>
+      <w:tr>
+        <w:tc>
+          <w:tcPr>
+            <w:tcW w:type="dxa" w:w="600"/>
+            <w:tcBorders>
+              <w:top w:val="single" w:color="D9D2D5" w:sz="1"/>
+              <w:left w:val="single" w:color="D9D2D5" w:sz="1"/>
+              <w:bottom w:val="single" w:color="D9D2D5" w:sz="1"/>
+              <w:right w:val="single" w:color="D9D2D5" w:sz="1"/>
+            </w:tcBorders>
+            <w:shd w:fill="FAF5F7" w:color="auto" w:val="clear"/>
+            <w:tcMar>
+              <w:top w:type="dxa" w:w="70"/>
+              <w:left w:type="dxa" w:w="110"/>
+              <w:bottom w:type="dxa" w:w="70"/>
+              <w:right w:type="dxa" w:w="110"/>
+            </w:tcMar>
+            <w:vAlign w:val="center"/>
+          </w:tcPr>
+          <w:p>
+            <w:r>
+              <w:rPr>
+                <w:sz w:val="19"/>
+                <w:szCs w:val="19"/>
+              </w:rPr>
+              <w:t xml:space="preserve">8</w:t>
+            </w:r>
+          </w:p>
+        </w:tc>
+        <w:tc>
+          <w:tcPr>
+            <w:tcW w:type="dxa" w:w="3400"/>
+            <w:tcBorders>
+              <w:top w:val="single" w:color="D9D2D5" w:sz="1"/>
+              <w:left w:val="single" w:color="D9D2D5" w:sz="1"/>
+              <w:bottom w:val="single" w:color="D9D2D5" w:sz="1"/>
+              <w:right w:val="single" w:color="D9D2D5" w:sz="1"/>
+            </w:tcBorders>
+            <w:shd w:fill="FAF5F7" w:color="auto" w:val="clear"/>
+            <w:tcMar>
+              <w:top w:type="dxa" w:w="70"/>
+              <w:left w:type="dxa" w:w="110"/>
+              <w:bottom w:type="dxa" w:w="70"/>
+              <w:right w:type="dxa" w:w="110"/>
+            </w:tcMar>
+            <w:vAlign w:val="center"/>
+          </w:tcPr>
+          <w:p>
+            <w:r>
+              <w:rPr>
+                <w:sz w:val="19"/>
+                <w:szCs w:val="19"/>
+              </w:rPr>
+              <w:t xml:space="preserve">Safety-stock method</w:t>
+            </w:r>
+          </w:p>
+        </w:tc>
+        <w:tc>
+          <w:tcPr>
+            <w:tcW w:type="dxa" w:w="1560"/>
+            <w:tcBorders>
+              <w:top w:val="single" w:color="D9D2D5" w:sz="1"/>
+              <w:left w:val="single" w:color="D9D2D5" w:sz="1"/>
+              <w:bottom w:val="single" w:color="D9D2D5" w:sz="1"/>
+              <w:right w:val="single" w:color="D9D2D5" w:sz="1"/>
+            </w:tcBorders>
+            <w:shd w:fill="FAF5F7" w:color="auto" w:val="clear"/>
+            <w:tcMar>
+              <w:top w:type="dxa" w:w="70"/>
+              <w:left w:type="dxa" w:w="110"/>
+              <w:bottom w:type="dxa" w:w="70"/>
+              <w:right w:type="dxa" w:w="110"/>
+            </w:tcMar>
+            <w:vAlign w:val="center"/>
+          </w:tcPr>
+          <w:p>
+            <w:r>
+              <w:rPr>
+                <w:sz w:val="19"/>
+                <w:szCs w:val="19"/>
+              </w:rPr>
+              <w:t xml:space="preserve">Default</w:t>
+            </w:r>
+          </w:p>
+        </w:tc>
+        <w:tc>
+          <w:tcPr>
+            <w:tcW w:type="dxa" w:w="3800"/>
+            <w:tcBorders>
+              <w:top w:val="single" w:color="D9D2D5" w:sz="1"/>
+              <w:left w:val="single" w:color="D9D2D5" w:sz="1"/>
+              <w:bottom w:val="single" w:color="D9D2D5" w:sz="1"/>
+              <w:right w:val="single" w:color="D9D2D5" w:sz="1"/>
+            </w:tcBorders>
+            <w:shd w:fill="FAF5F7" w:color="auto" w:val="clear"/>
+            <w:tcMar>
+              <w:top w:type="dxa" w:w="70"/>
+              <w:left w:type="dxa" w:w="110"/>
+              <w:bottom w:type="dxa" w:w="70"/>
+              <w:right w:type="dxa" w:w="110"/>
+            </w:tcMar>
+            <w:vAlign w:val="center"/>
+          </w:tcPr>
+          <w:p>
+            <w:r>
+              <w:rPr>
+                <w:sz w:val="19"/>
+                <w:szCs w:val="19"/>
+              </w:rPr>
+              <w:t xml:space="preserve">Fixed per SKU now; statistical later</w:t>
+            </w:r>
+          </w:p>
+        </w:tc>
+      </w:tr>
+      <w:tr>
+        <w:tc>
+          <w:tcPr>
+            <w:tcW w:type="dxa" w:w="600"/>
+            <w:tcBorders>
+              <w:top w:val="single" w:color="D9D2D5" w:sz="1"/>
+              <w:left w:val="single" w:color="D9D2D5" w:sz="1"/>
+              <w:bottom w:val="single" w:color="D9D2D5" w:sz="1"/>
+              <w:right w:val="single" w:color="D9D2D5" w:sz="1"/>
+            </w:tcBorders>
+            <w:tcMar>
+              <w:top w:type="dxa" w:w="70"/>
+              <w:left w:type="dxa" w:w="110"/>
+              <w:bottom w:type="dxa" w:w="70"/>
+              <w:right w:type="dxa" w:w="110"/>
+            </w:tcMar>
+            <w:vAlign w:val="center"/>
+          </w:tcPr>
+          <w:p>
+            <w:r>
+              <w:rPr>
+                <w:sz w:val="19"/>
+                <w:szCs w:val="19"/>
+              </w:rPr>
+              <w:t xml:space="preserve">9</w:t>
+            </w:r>
+          </w:p>
+        </w:tc>
+        <w:tc>
+          <w:tcPr>
+            <w:tcW w:type="dxa" w:w="3400"/>
+            <w:tcBorders>
+              <w:top w:val="single" w:color="D9D2D5" w:sz="1"/>
+              <w:left w:val="single" w:color="D9D2D5" w:sz="1"/>
+              <w:bottom w:val="single" w:color="D9D2D5" w:sz="1"/>
+              <w:right w:val="single" w:color="D9D2D5" w:sz="1"/>
+            </w:tcBorders>
+            <w:tcMar>
+              <w:top w:type="dxa" w:w="70"/>
+              <w:left w:type="dxa" w:w="110"/>
+              <w:bottom w:type="dxa" w:w="70"/>
+              <w:right w:type="dxa" w:w="110"/>
+            </w:tcMar>
+            <w:vAlign w:val="center"/>
+          </w:tcPr>
+          <w:p>
+            <w:r>
+              <w:rPr>
+                <w:sz w:val="19"/>
+                <w:szCs w:val="19"/>
+              </w:rPr>
               <w:t xml:space="preserve">Per-vendor data method</w:t>
             </w:r>
           </w:p>
@@ -12069,7 +13405,7 @@
                 <w:sz w:val="19"/>
                 <w:szCs w:val="19"/>
               </w:rPr>
-              <w:t xml:space="preserve">6</w:t>
+              <w:t xml:space="preserve">10</w:t>
             </w:r>
           </w:p>
         </w:tc>
@@ -12182,7 +13518,7 @@
                 <w:sz w:val="19"/>
                 <w:szCs w:val="19"/>
               </w:rPr>
-              <w:t xml:space="preserve">7</w:t>
+              <w:t xml:space="preserve">11</w:t>
             </w:r>
           </w:p>
         </w:tc>
@@ -12293,7 +13629,7 @@
                 <w:sz w:val="19"/>
                 <w:szCs w:val="19"/>
               </w:rPr>
-              <w:t xml:space="preserve">8</w:t>
+              <w:t xml:space="preserve">12</w:t>
             </w:r>
           </w:p>
         </w:tc>
@@ -12321,6 +13657,118 @@
                 <w:sz w:val="19"/>
                 <w:szCs w:val="19"/>
               </w:rPr>
+              <w:t xml:space="preserve">Marketplace go/no-go &amp; timing</w:t>
+            </w:r>
+          </w:p>
+        </w:tc>
+        <w:tc>
+          <w:tcPr>
+            <w:tcW w:type="dxa" w:w="1560"/>
+            <w:tcBorders>
+              <w:top w:val="single" w:color="D9D2D5" w:sz="1"/>
+              <w:left w:val="single" w:color="D9D2D5" w:sz="1"/>
+              <w:bottom w:val="single" w:color="D9D2D5" w:sz="1"/>
+              <w:right w:val="single" w:color="D9D2D5" w:sz="1"/>
+            </w:tcBorders>
+            <w:shd w:fill="FAF5F7" w:color="auto" w:val="clear"/>
+            <w:tcMar>
+              <w:top w:type="dxa" w:w="70"/>
+              <w:left w:type="dxa" w:w="110"/>
+              <w:bottom w:type="dxa" w:w="70"/>
+              <w:right w:type="dxa" w:w="110"/>
+            </w:tcMar>
+            <w:vAlign w:val="center"/>
+          </w:tcPr>
+          <w:p>
+            <w:r>
+              <w:rPr>
+                <w:sz w:val="19"/>
+                <w:szCs w:val="19"/>
+              </w:rPr>
+              <w:t xml:space="preserve">Open</w:t>
+            </w:r>
+          </w:p>
+        </w:tc>
+        <w:tc>
+          <w:tcPr>
+            <w:tcW w:type="dxa" w:w="3800"/>
+            <w:tcBorders>
+              <w:top w:val="single" w:color="D9D2D5" w:sz="1"/>
+              <w:left w:val="single" w:color="D9D2D5" w:sz="1"/>
+              <w:bottom w:val="single" w:color="D9D2D5" w:sz="1"/>
+              <w:right w:val="single" w:color="D9D2D5" w:sz="1"/>
+            </w:tcBorders>
+            <w:shd w:fill="FAF5F7" w:color="auto" w:val="clear"/>
+            <w:tcMar>
+              <w:top w:type="dxa" w:w="70"/>
+              <w:left w:type="dxa" w:w="110"/>
+              <w:bottom w:type="dxa" w:w="70"/>
+              <w:right w:type="dxa" w:w="110"/>
+            </w:tcMar>
+            <w:vAlign w:val="center"/>
+          </w:tcPr>
+          <w:p>
+            <w:r>
+              <w:rPr>
+                <w:sz w:val="19"/>
+                <w:szCs w:val="19"/>
+              </w:rPr>
+              <w:t xml:space="preserve">Design now; build (Phase 7) only if/when needed</w:t>
+            </w:r>
+          </w:p>
+        </w:tc>
+      </w:tr>
+      <w:tr>
+        <w:tc>
+          <w:tcPr>
+            <w:tcW w:type="dxa" w:w="600"/>
+            <w:tcBorders>
+              <w:top w:val="single" w:color="D9D2D5" w:sz="1"/>
+              <w:left w:val="single" w:color="D9D2D5" w:sz="1"/>
+              <w:bottom w:val="single" w:color="D9D2D5" w:sz="1"/>
+              <w:right w:val="single" w:color="D9D2D5" w:sz="1"/>
+            </w:tcBorders>
+            <w:tcMar>
+              <w:top w:type="dxa" w:w="70"/>
+              <w:left w:type="dxa" w:w="110"/>
+              <w:bottom w:type="dxa" w:w="70"/>
+              <w:right w:type="dxa" w:w="110"/>
+            </w:tcMar>
+            <w:vAlign w:val="center"/>
+          </w:tcPr>
+          <w:p>
+            <w:r>
+              <w:rPr>
+                <w:sz w:val="19"/>
+                <w:szCs w:val="19"/>
+              </w:rPr>
+              <w:t xml:space="preserve">13</w:t>
+            </w:r>
+          </w:p>
+        </w:tc>
+        <w:tc>
+          <w:tcPr>
+            <w:tcW w:type="dxa" w:w="3400"/>
+            <w:tcBorders>
+              <w:top w:val="single" w:color="D9D2D5" w:sz="1"/>
+              <w:left w:val="single" w:color="D9D2D5" w:sz="1"/>
+              <w:bottom w:val="single" w:color="D9D2D5" w:sz="1"/>
+              <w:right w:val="single" w:color="D9D2D5" w:sz="1"/>
+            </w:tcBorders>
+            <w:tcMar>
+              <w:top w:type="dxa" w:w="70"/>
+              <w:left w:type="dxa" w:w="110"/>
+              <w:bottom w:type="dxa" w:w="70"/>
+              <w:right w:type="dxa" w:w="110"/>
+            </w:tcMar>
+            <w:vAlign w:val="center"/>
+          </w:tcPr>
+          <w:p>
+            <w:r>
+              <w:rPr>
+                <w:sz w:val="19"/>
+                <w:szCs w:val="19"/>
+              </w:rPr>
               <w:t xml:space="preserve">Chatbot scope at launch</w:t>
             </w:r>
           </w:p>
@@ -12334,7 +13782,6 @@
               <w:bottom w:val="single" w:color="D9D2D5" w:sz="1"/>
               <w:right w:val="single" w:color="D9D2D5" w:sz="1"/>
             </w:tcBorders>
-            <w:shd w:fill="FAF5F7" w:color="auto" w:val="clear"/>
             <w:tcMar>
               <w:top w:type="dxa" w:w="70"/>
               <w:left w:type="dxa" w:w="110"/>
@@ -12362,7 +13809,6 @@
               <w:bottom w:val="single" w:color="D9D2D5" w:sz="1"/>
               <w:right w:val="single" w:color="D9D2D5" w:sz="1"/>
             </w:tcBorders>
-            <w:shd w:fill="FAF5F7" w:color="auto" w:val="clear"/>
             <w:tcMar>
               <w:top w:type="dxa" w:w="70"/>
               <w:left w:type="dxa" w:w="110"/>
@@ -13382,6 +14828,804 @@
                 <w:szCs w:val="19"/>
               </w:rPr>
               <w:t xml:space="preserve">The human-readable part of a URL</w:t>
+            </w:r>
+          </w:p>
+        </w:tc>
+      </w:tr>
+      <w:tr>
+        <w:tc>
+          <w:tcPr>
+            <w:tcW w:type="dxa" w:w="2600"/>
+            <w:tcBorders>
+              <w:top w:val="single" w:color="D9D2D5" w:sz="1"/>
+              <w:left w:val="single" w:color="D9D2D5" w:sz="1"/>
+              <w:bottom w:val="single" w:color="D9D2D5" w:sz="1"/>
+              <w:right w:val="single" w:color="D9D2D5" w:sz="1"/>
+            </w:tcBorders>
+            <w:tcMar>
+              <w:top w:type="dxa" w:w="70"/>
+              <w:left w:type="dxa" w:w="110"/>
+              <w:bottom w:type="dxa" w:w="70"/>
+              <w:right w:type="dxa" w:w="110"/>
+            </w:tcMar>
+            <w:vAlign w:val="center"/>
+          </w:tcPr>
+          <w:p>
+            <w:r>
+              <w:rPr>
+                <w:sz w:val="19"/>
+                <w:szCs w:val="19"/>
+              </w:rPr>
+              <w:t xml:space="preserve">Seller / merchant</w:t>
+            </w:r>
+          </w:p>
+        </w:tc>
+        <w:tc>
+          <w:tcPr>
+            <w:tcW w:type="dxa" w:w="6760"/>
+            <w:tcBorders>
+              <w:top w:val="single" w:color="D9D2D5" w:sz="1"/>
+              <w:left w:val="single" w:color="D9D2D5" w:sz="1"/>
+              <w:bottom w:val="single" w:color="D9D2D5" w:sz="1"/>
+              <w:right w:val="single" w:color="D9D2D5" w:sz="1"/>
+            </w:tcBorders>
+            <w:tcMar>
+              <w:top w:type="dxa" w:w="70"/>
+              <w:left w:type="dxa" w:w="110"/>
+              <w:bottom w:type="dxa" w:w="70"/>
+              <w:right w:type="dxa" w:w="110"/>
+            </w:tcMar>
+            <w:vAlign w:val="center"/>
+          </w:tcPr>
+          <w:p>
+            <w:r>
+              <w:rPr>
+                <w:sz w:val="19"/>
+                <w:szCs w:val="19"/>
+              </w:rPr>
+              <w:t xml:space="preserve">An entity that lists and sells products and receives payment; one house seller at launch</w:t>
+            </w:r>
+          </w:p>
+        </w:tc>
+      </w:tr>
+      <w:tr>
+        <w:tc>
+          <w:tcPr>
+            <w:tcW w:type="dxa" w:w="2600"/>
+            <w:tcBorders>
+              <w:top w:val="single" w:color="D9D2D5" w:sz="1"/>
+              <w:left w:val="single" w:color="D9D2D5" w:sz="1"/>
+              <w:bottom w:val="single" w:color="D9D2D5" w:sz="1"/>
+              <w:right w:val="single" w:color="D9D2D5" w:sz="1"/>
+            </w:tcBorders>
+            <w:shd w:fill="FAF5F7" w:color="auto" w:val="clear"/>
+            <w:tcMar>
+              <w:top w:type="dxa" w:w="70"/>
+              <w:left w:type="dxa" w:w="110"/>
+              <w:bottom w:type="dxa" w:w="70"/>
+              <w:right w:type="dxa" w:w="110"/>
+            </w:tcMar>
+            <w:vAlign w:val="center"/>
+          </w:tcPr>
+          <w:p>
+            <w:r>
+              <w:rPr>
+                <w:sz w:val="19"/>
+                <w:szCs w:val="19"/>
+              </w:rPr>
+              <w:t xml:space="preserve">Listing / offer</w:t>
+            </w:r>
+          </w:p>
+        </w:tc>
+        <w:tc>
+          <w:tcPr>
+            <w:tcW w:type="dxa" w:w="6760"/>
+            <w:tcBorders>
+              <w:top w:val="single" w:color="D9D2D5" w:sz="1"/>
+              <w:left w:val="single" w:color="D9D2D5" w:sz="1"/>
+              <w:bottom w:val="single" w:color="D9D2D5" w:sz="1"/>
+              <w:right w:val="single" w:color="D9D2D5" w:sz="1"/>
+            </w:tcBorders>
+            <w:shd w:fill="FAF5F7" w:color="auto" w:val="clear"/>
+            <w:tcMar>
+              <w:top w:type="dxa" w:w="70"/>
+              <w:left w:type="dxa" w:w="110"/>
+              <w:bottom w:type="dxa" w:w="70"/>
+              <w:right w:type="dxa" w:w="110"/>
+            </w:tcMar>
+            <w:vAlign w:val="center"/>
+          </w:tcPr>
+          <w:p>
+            <w:r>
+              <w:rPr>
+                <w:sz w:val="19"/>
+                <w:szCs w:val="19"/>
+              </w:rPr>
+              <w:t xml:space="preserve">A seller’s sellable unit (price, stock, fulfilment) for a variant; cart and orders reference listings</w:t>
+            </w:r>
+          </w:p>
+        </w:tc>
+      </w:tr>
+      <w:tr>
+        <w:tc>
+          <w:tcPr>
+            <w:tcW w:type="dxa" w:w="2600"/>
+            <w:tcBorders>
+              <w:top w:val="single" w:color="D9D2D5" w:sz="1"/>
+              <w:left w:val="single" w:color="D9D2D5" w:sz="1"/>
+              <w:bottom w:val="single" w:color="D9D2D5" w:sz="1"/>
+              <w:right w:val="single" w:color="D9D2D5" w:sz="1"/>
+            </w:tcBorders>
+            <w:tcMar>
+              <w:top w:type="dxa" w:w="70"/>
+              <w:left w:type="dxa" w:w="110"/>
+              <w:bottom w:type="dxa" w:w="70"/>
+              <w:right w:type="dxa" w:w="110"/>
+            </w:tcMar>
+            <w:vAlign w:val="center"/>
+          </w:tcPr>
+          <w:p>
+            <w:r>
+              <w:rPr>
+                <w:sz w:val="19"/>
+                <w:szCs w:val="19"/>
+              </w:rPr>
+              <w:t xml:space="preserve">Buy box</w:t>
+            </w:r>
+          </w:p>
+        </w:tc>
+        <w:tc>
+          <w:tcPr>
+            <w:tcW w:type="dxa" w:w="6760"/>
+            <w:tcBorders>
+              <w:top w:val="single" w:color="D9D2D5" w:sz="1"/>
+              <w:left w:val="single" w:color="D9D2D5" w:sz="1"/>
+              <w:bottom w:val="single" w:color="D9D2D5" w:sz="1"/>
+              <w:right w:val="single" w:color="D9D2D5" w:sz="1"/>
+            </w:tcBorders>
+            <w:tcMar>
+              <w:top w:type="dxa" w:w="70"/>
+              <w:left w:type="dxa" w:w="110"/>
+              <w:bottom w:type="dxa" w:w="70"/>
+              <w:right w:type="dxa" w:w="110"/>
+            </w:tcMar>
+            <w:vAlign w:val="center"/>
+          </w:tcPr>
+          <w:p>
+            <w:r>
+              <w:rPr>
+                <w:sz w:val="19"/>
+                <w:szCs w:val="19"/>
+              </w:rPr>
+              <w:t xml:space="preserve">Logic that picks the default offer when multiple sellers list the same item (future)</w:t>
+            </w:r>
+          </w:p>
+        </w:tc>
+      </w:tr>
+      <w:tr>
+        <w:tc>
+          <w:tcPr>
+            <w:tcW w:type="dxa" w:w="2600"/>
+            <w:tcBorders>
+              <w:top w:val="single" w:color="D9D2D5" w:sz="1"/>
+              <w:left w:val="single" w:color="D9D2D5" w:sz="1"/>
+              <w:bottom w:val="single" w:color="D9D2D5" w:sz="1"/>
+              <w:right w:val="single" w:color="D9D2D5" w:sz="1"/>
+            </w:tcBorders>
+            <w:shd w:fill="FAF5F7" w:color="auto" w:val="clear"/>
+            <w:tcMar>
+              <w:top w:type="dxa" w:w="70"/>
+              <w:left w:type="dxa" w:w="110"/>
+              <w:bottom w:type="dxa" w:w="70"/>
+              <w:right w:type="dxa" w:w="110"/>
+            </w:tcMar>
+            <w:vAlign w:val="center"/>
+          </w:tcPr>
+          <w:p>
+            <w:r>
+              <w:rPr>
+                <w:sz w:val="19"/>
+                <w:szCs w:val="19"/>
+              </w:rPr>
+              <w:t xml:space="preserve">Split settlement</w:t>
+            </w:r>
+          </w:p>
+        </w:tc>
+        <w:tc>
+          <w:tcPr>
+            <w:tcW w:type="dxa" w:w="6760"/>
+            <w:tcBorders>
+              <w:top w:val="single" w:color="D9D2D5" w:sz="1"/>
+              <w:left w:val="single" w:color="D9D2D5" w:sz="1"/>
+              <w:bottom w:val="single" w:color="D9D2D5" w:sz="1"/>
+              <w:right w:val="single" w:color="D9D2D5" w:sz="1"/>
+            </w:tcBorders>
+            <w:shd w:fill="FAF5F7" w:color="auto" w:val="clear"/>
+            <w:tcMar>
+              <w:top w:type="dxa" w:w="70"/>
+              <w:left w:type="dxa" w:w="110"/>
+              <w:bottom w:type="dxa" w:w="70"/>
+              <w:right w:type="dxa" w:w="110"/>
+            </w:tcMar>
+            <w:vAlign w:val="center"/>
+          </w:tcPr>
+          <w:p>
+            <w:r>
+              <w:rPr>
+                <w:sz w:val="19"/>
+                <w:szCs w:val="19"/>
+              </w:rPr>
+              <w:t xml:space="preserve">Paying multiple sellers from one customer payment (e.g. Razorpay Route)</w:t>
+            </w:r>
+          </w:p>
+        </w:tc>
+      </w:tr>
+      <w:tr>
+        <w:tc>
+          <w:tcPr>
+            <w:tcW w:type="dxa" w:w="2600"/>
+            <w:tcBorders>
+              <w:top w:val="single" w:color="D9D2D5" w:sz="1"/>
+              <w:left w:val="single" w:color="D9D2D5" w:sz="1"/>
+              <w:bottom w:val="single" w:color="D9D2D5" w:sz="1"/>
+              <w:right w:val="single" w:color="D9D2D5" w:sz="1"/>
+            </w:tcBorders>
+            <w:tcMar>
+              <w:top w:type="dxa" w:w="70"/>
+              <w:left w:type="dxa" w:w="110"/>
+              <w:bottom w:type="dxa" w:w="70"/>
+              <w:right w:type="dxa" w:w="110"/>
+            </w:tcMar>
+            <w:vAlign w:val="center"/>
+          </w:tcPr>
+          <w:p>
+            <w:r>
+              <w:rPr>
+                <w:sz w:val="19"/>
+                <w:szCs w:val="19"/>
+              </w:rPr>
+              <w:t xml:space="preserve">Stock ledger</w:t>
+            </w:r>
+          </w:p>
+        </w:tc>
+        <w:tc>
+          <w:tcPr>
+            <w:tcW w:type="dxa" w:w="6760"/>
+            <w:tcBorders>
+              <w:top w:val="single" w:color="D9D2D5" w:sz="1"/>
+              <w:left w:val="single" w:color="D9D2D5" w:sz="1"/>
+              <w:bottom w:val="single" w:color="D9D2D5" w:sz="1"/>
+              <w:right w:val="single" w:color="D9D2D5" w:sz="1"/>
+            </w:tcBorders>
+            <w:tcMar>
+              <w:top w:type="dxa" w:w="70"/>
+              <w:left w:type="dxa" w:w="110"/>
+              <w:bottom w:type="dxa" w:w="70"/>
+              <w:right w:type="dxa" w:w="110"/>
+            </w:tcMar>
+            <w:vAlign w:val="center"/>
+          </w:tcPr>
+          <w:p>
+            <w:r>
+              <w:rPr>
+                <w:sz w:val="19"/>
+                <w:szCs w:val="19"/>
+              </w:rPr>
+              <w:t xml:space="preserve">Immutable record of inventory movements; on-hand is derived from it</w:t>
+            </w:r>
+          </w:p>
+        </w:tc>
+      </w:tr>
+      <w:tr>
+        <w:tc>
+          <w:tcPr>
+            <w:tcW w:type="dxa" w:w="2600"/>
+            <w:tcBorders>
+              <w:top w:val="single" w:color="D9D2D5" w:sz="1"/>
+              <w:left w:val="single" w:color="D9D2D5" w:sz="1"/>
+              <w:bottom w:val="single" w:color="D9D2D5" w:sz="1"/>
+              <w:right w:val="single" w:color="D9D2D5" w:sz="1"/>
+            </w:tcBorders>
+            <w:shd w:fill="FAF5F7" w:color="auto" w:val="clear"/>
+            <w:tcMar>
+              <w:top w:type="dxa" w:w="70"/>
+              <w:left w:type="dxa" w:w="110"/>
+              <w:bottom w:type="dxa" w:w="70"/>
+              <w:right w:type="dxa" w:w="110"/>
+            </w:tcMar>
+            <w:vAlign w:val="center"/>
+          </w:tcPr>
+          <w:p>
+            <w:r>
+              <w:rPr>
+                <w:sz w:val="19"/>
+                <w:szCs w:val="19"/>
+              </w:rPr>
+              <w:t xml:space="preserve">On-hand / reserved / available</w:t>
+            </w:r>
+          </w:p>
+        </w:tc>
+        <w:tc>
+          <w:tcPr>
+            <w:tcW w:type="dxa" w:w="6760"/>
+            <w:tcBorders>
+              <w:top w:val="single" w:color="D9D2D5" w:sz="1"/>
+              <w:left w:val="single" w:color="D9D2D5" w:sz="1"/>
+              <w:bottom w:val="single" w:color="D9D2D5" w:sz="1"/>
+              <w:right w:val="single" w:color="D9D2D5" w:sz="1"/>
+            </w:tcBorders>
+            <w:shd w:fill="FAF5F7" w:color="auto" w:val="clear"/>
+            <w:tcMar>
+              <w:top w:type="dxa" w:w="70"/>
+              <w:left w:type="dxa" w:w="110"/>
+              <w:bottom w:type="dxa" w:w="70"/>
+              <w:right w:type="dxa" w:w="110"/>
+            </w:tcMar>
+            <w:vAlign w:val="center"/>
+          </w:tcPr>
+          <w:p>
+            <w:r>
+              <w:rPr>
+                <w:sz w:val="19"/>
+                <w:szCs w:val="19"/>
+              </w:rPr>
+              <w:t xml:space="preserve">Physically held / allocated to orders / sellable now</w:t>
+            </w:r>
+          </w:p>
+        </w:tc>
+      </w:tr>
+      <w:tr>
+        <w:tc>
+          <w:tcPr>
+            <w:tcW w:type="dxa" w:w="2600"/>
+            <w:tcBorders>
+              <w:top w:val="single" w:color="D9D2D5" w:sz="1"/>
+              <w:left w:val="single" w:color="D9D2D5" w:sz="1"/>
+              <w:bottom w:val="single" w:color="D9D2D5" w:sz="1"/>
+              <w:right w:val="single" w:color="D9D2D5" w:sz="1"/>
+            </w:tcBorders>
+            <w:tcMar>
+              <w:top w:type="dxa" w:w="70"/>
+              <w:left w:type="dxa" w:w="110"/>
+              <w:bottom w:type="dxa" w:w="70"/>
+              <w:right w:type="dxa" w:w="110"/>
+            </w:tcMar>
+            <w:vAlign w:val="center"/>
+          </w:tcPr>
+          <w:p>
+            <w:r>
+              <w:rPr>
+                <w:sz w:val="19"/>
+                <w:szCs w:val="19"/>
+              </w:rPr>
+              <w:t xml:space="preserve">On-order (incoming)</w:t>
+            </w:r>
+          </w:p>
+        </w:tc>
+        <w:tc>
+          <w:tcPr>
+            <w:tcW w:type="dxa" w:w="6760"/>
+            <w:tcBorders>
+              <w:top w:val="single" w:color="D9D2D5" w:sz="1"/>
+              <w:left w:val="single" w:color="D9D2D5" w:sz="1"/>
+              <w:bottom w:val="single" w:color="D9D2D5" w:sz="1"/>
+              <w:right w:val="single" w:color="D9D2D5" w:sz="1"/>
+            </w:tcBorders>
+            <w:tcMar>
+              <w:top w:type="dxa" w:w="70"/>
+              <w:left w:type="dxa" w:w="110"/>
+              <w:bottom w:type="dxa" w:w="70"/>
+              <w:right w:type="dxa" w:w="110"/>
+            </w:tcMar>
+            <w:vAlign w:val="center"/>
+          </w:tcPr>
+          <w:p>
+            <w:r>
+              <w:rPr>
+                <w:sz w:val="19"/>
+                <w:szCs w:val="19"/>
+              </w:rPr>
+              <w:t xml:space="preserve">Quantity inbound on open purchase orders</w:t>
+            </w:r>
+          </w:p>
+        </w:tc>
+      </w:tr>
+      <w:tr>
+        <w:tc>
+          <w:tcPr>
+            <w:tcW w:type="dxa" w:w="2600"/>
+            <w:tcBorders>
+              <w:top w:val="single" w:color="D9D2D5" w:sz="1"/>
+              <w:left w:val="single" w:color="D9D2D5" w:sz="1"/>
+              <w:bottom w:val="single" w:color="D9D2D5" w:sz="1"/>
+              <w:right w:val="single" w:color="D9D2D5" w:sz="1"/>
+            </w:tcBorders>
+            <w:shd w:fill="FAF5F7" w:color="auto" w:val="clear"/>
+            <w:tcMar>
+              <w:top w:type="dxa" w:w="70"/>
+              <w:left w:type="dxa" w:w="110"/>
+              <w:bottom w:type="dxa" w:w="70"/>
+              <w:right w:type="dxa" w:w="110"/>
+            </w:tcMar>
+            <w:vAlign w:val="center"/>
+          </w:tcPr>
+          <w:p>
+            <w:r>
+              <w:rPr>
+                <w:sz w:val="19"/>
+                <w:szCs w:val="19"/>
+              </w:rPr>
+              <w:t xml:space="preserve">Safety stock</w:t>
+            </w:r>
+          </w:p>
+        </w:tc>
+        <w:tc>
+          <w:tcPr>
+            <w:tcW w:type="dxa" w:w="6760"/>
+            <w:tcBorders>
+              <w:top w:val="single" w:color="D9D2D5" w:sz="1"/>
+              <w:left w:val="single" w:color="D9D2D5" w:sz="1"/>
+              <w:bottom w:val="single" w:color="D9D2D5" w:sz="1"/>
+              <w:right w:val="single" w:color="D9D2D5" w:sz="1"/>
+            </w:tcBorders>
+            <w:shd w:fill="FAF5F7" w:color="auto" w:val="clear"/>
+            <w:tcMar>
+              <w:top w:type="dxa" w:w="70"/>
+              <w:left w:type="dxa" w:w="110"/>
+              <w:bottom w:type="dxa" w:w="70"/>
+              <w:right w:type="dxa" w:w="110"/>
+            </w:tcMar>
+            <w:vAlign w:val="center"/>
+          </w:tcPr>
+          <w:p>
+            <w:r>
+              <w:rPr>
+                <w:sz w:val="19"/>
+                <w:szCs w:val="19"/>
+              </w:rPr>
+              <w:t xml:space="preserve">Buffer stock held to absorb demand and lead-time variability</w:t>
+            </w:r>
+          </w:p>
+        </w:tc>
+      </w:tr>
+      <w:tr>
+        <w:tc>
+          <w:tcPr>
+            <w:tcW w:type="dxa" w:w="2600"/>
+            <w:tcBorders>
+              <w:top w:val="single" w:color="D9D2D5" w:sz="1"/>
+              <w:left w:val="single" w:color="D9D2D5" w:sz="1"/>
+              <w:bottom w:val="single" w:color="D9D2D5" w:sz="1"/>
+              <w:right w:val="single" w:color="D9D2D5" w:sz="1"/>
+            </w:tcBorders>
+            <w:tcMar>
+              <w:top w:type="dxa" w:w="70"/>
+              <w:left w:type="dxa" w:w="110"/>
+              <w:bottom w:type="dxa" w:w="70"/>
+              <w:right w:type="dxa" w:w="110"/>
+            </w:tcMar>
+            <w:vAlign w:val="center"/>
+          </w:tcPr>
+          <w:p>
+            <w:r>
+              <w:rPr>
+                <w:sz w:val="19"/>
+                <w:szCs w:val="19"/>
+              </w:rPr>
+              <w:t xml:space="preserve">Reorder point (ROP)</w:t>
+            </w:r>
+          </w:p>
+        </w:tc>
+        <w:tc>
+          <w:tcPr>
+            <w:tcW w:type="dxa" w:w="6760"/>
+            <w:tcBorders>
+              <w:top w:val="single" w:color="D9D2D5" w:sz="1"/>
+              <w:left w:val="single" w:color="D9D2D5" w:sz="1"/>
+              <w:bottom w:val="single" w:color="D9D2D5" w:sz="1"/>
+              <w:right w:val="single" w:color="D9D2D5" w:sz="1"/>
+            </w:tcBorders>
+            <w:tcMar>
+              <w:top w:type="dxa" w:w="70"/>
+              <w:left w:type="dxa" w:w="110"/>
+              <w:bottom w:type="dxa" w:w="70"/>
+              <w:right w:type="dxa" w:w="110"/>
+            </w:tcMar>
+            <w:vAlign w:val="center"/>
+          </w:tcPr>
+          <w:p>
+            <w:r>
+              <w:rPr>
+                <w:sz w:val="19"/>
+                <w:szCs w:val="19"/>
+              </w:rPr>
+              <w:t xml:space="preserve">Stock level at which replenishment is triggered</w:t>
+            </w:r>
+          </w:p>
+        </w:tc>
+      </w:tr>
+      <w:tr>
+        <w:tc>
+          <w:tcPr>
+            <w:tcW w:type="dxa" w:w="2600"/>
+            <w:tcBorders>
+              <w:top w:val="single" w:color="D9D2D5" w:sz="1"/>
+              <w:left w:val="single" w:color="D9D2D5" w:sz="1"/>
+              <w:bottom w:val="single" w:color="D9D2D5" w:sz="1"/>
+              <w:right w:val="single" w:color="D9D2D5" w:sz="1"/>
+            </w:tcBorders>
+            <w:shd w:fill="FAF5F7" w:color="auto" w:val="clear"/>
+            <w:tcMar>
+              <w:top w:type="dxa" w:w="70"/>
+              <w:left w:type="dxa" w:w="110"/>
+              <w:bottom w:type="dxa" w:w="70"/>
+              <w:right w:type="dxa" w:w="110"/>
+            </w:tcMar>
+            <w:vAlign w:val="center"/>
+          </w:tcPr>
+          <w:p>
+            <w:r>
+              <w:rPr>
+                <w:sz w:val="19"/>
+                <w:szCs w:val="19"/>
+              </w:rPr>
+              <w:t xml:space="preserve">Reorder qty / EOQ</w:t>
+            </w:r>
+          </w:p>
+        </w:tc>
+        <w:tc>
+          <w:tcPr>
+            <w:tcW w:type="dxa" w:w="6760"/>
+            <w:tcBorders>
+              <w:top w:val="single" w:color="D9D2D5" w:sz="1"/>
+              <w:left w:val="single" w:color="D9D2D5" w:sz="1"/>
+              <w:bottom w:val="single" w:color="D9D2D5" w:sz="1"/>
+              <w:right w:val="single" w:color="D9D2D5" w:sz="1"/>
+            </w:tcBorders>
+            <w:shd w:fill="FAF5F7" w:color="auto" w:val="clear"/>
+            <w:tcMar>
+              <w:top w:type="dxa" w:w="70"/>
+              <w:left w:type="dxa" w:w="110"/>
+              <w:bottom w:type="dxa" w:w="70"/>
+              <w:right w:type="dxa" w:w="110"/>
+            </w:tcMar>
+            <w:vAlign w:val="center"/>
+          </w:tcPr>
+          <w:p>
+            <w:r>
+              <w:rPr>
+                <w:sz w:val="19"/>
+                <w:szCs w:val="19"/>
+              </w:rPr>
+              <w:t xml:space="preserve">How much to reorder; EOQ is the cost-optimal lot size</w:t>
+            </w:r>
+          </w:p>
+        </w:tc>
+      </w:tr>
+      <w:tr>
+        <w:tc>
+          <w:tcPr>
+            <w:tcW w:type="dxa" w:w="2600"/>
+            <w:tcBorders>
+              <w:top w:val="single" w:color="D9D2D5" w:sz="1"/>
+              <w:left w:val="single" w:color="D9D2D5" w:sz="1"/>
+              <w:bottom w:val="single" w:color="D9D2D5" w:sz="1"/>
+              <w:right w:val="single" w:color="D9D2D5" w:sz="1"/>
+            </w:tcBorders>
+            <w:tcMar>
+              <w:top w:type="dxa" w:w="70"/>
+              <w:left w:type="dxa" w:w="110"/>
+              <w:bottom w:type="dxa" w:w="70"/>
+              <w:right w:type="dxa" w:w="110"/>
+            </w:tcMar>
+            <w:vAlign w:val="center"/>
+          </w:tcPr>
+          <w:p>
+            <w:r>
+              <w:rPr>
+                <w:sz w:val="19"/>
+                <w:szCs w:val="19"/>
+              </w:rPr>
+              <w:t xml:space="preserve">Lead time</w:t>
+            </w:r>
+          </w:p>
+        </w:tc>
+        <w:tc>
+          <w:tcPr>
+            <w:tcW w:type="dxa" w:w="6760"/>
+            <w:tcBorders>
+              <w:top w:val="single" w:color="D9D2D5" w:sz="1"/>
+              <w:left w:val="single" w:color="D9D2D5" w:sz="1"/>
+              <w:bottom w:val="single" w:color="D9D2D5" w:sz="1"/>
+              <w:right w:val="single" w:color="D9D2D5" w:sz="1"/>
+            </w:tcBorders>
+            <w:tcMar>
+              <w:top w:type="dxa" w:w="70"/>
+              <w:left w:type="dxa" w:w="110"/>
+              <w:bottom w:type="dxa" w:w="70"/>
+              <w:right w:type="dxa" w:w="110"/>
+            </w:tcMar>
+            <w:vAlign w:val="center"/>
+          </w:tcPr>
+          <w:p>
+            <w:r>
+              <w:rPr>
+                <w:sz w:val="19"/>
+                <w:szCs w:val="19"/>
+              </w:rPr>
+              <w:t xml:space="preserve">Time from placing a purchase order to stock being available</w:t>
+            </w:r>
+          </w:p>
+        </w:tc>
+      </w:tr>
+      <w:tr>
+        <w:tc>
+          <w:tcPr>
+            <w:tcW w:type="dxa" w:w="2600"/>
+            <w:tcBorders>
+              <w:top w:val="single" w:color="D9D2D5" w:sz="1"/>
+              <w:left w:val="single" w:color="D9D2D5" w:sz="1"/>
+              <w:bottom w:val="single" w:color="D9D2D5" w:sz="1"/>
+              <w:right w:val="single" w:color="D9D2D5" w:sz="1"/>
+            </w:tcBorders>
+            <w:shd w:fill="FAF5F7" w:color="auto" w:val="clear"/>
+            <w:tcMar>
+              <w:top w:type="dxa" w:w="70"/>
+              <w:left w:type="dxa" w:w="110"/>
+              <w:bottom w:type="dxa" w:w="70"/>
+              <w:right w:type="dxa" w:w="110"/>
+            </w:tcMar>
+            <w:vAlign w:val="center"/>
+          </w:tcPr>
+          <w:p>
+            <w:r>
+              <w:rPr>
+                <w:sz w:val="19"/>
+                <w:szCs w:val="19"/>
+              </w:rPr>
+              <w:t xml:space="preserve">Purchase order (PO)</w:t>
+            </w:r>
+          </w:p>
+        </w:tc>
+        <w:tc>
+          <w:tcPr>
+            <w:tcW w:type="dxa" w:w="6760"/>
+            <w:tcBorders>
+              <w:top w:val="single" w:color="D9D2D5" w:sz="1"/>
+              <w:left w:val="single" w:color="D9D2D5" w:sz="1"/>
+              <w:bottom w:val="single" w:color="D9D2D5" w:sz="1"/>
+              <w:right w:val="single" w:color="D9D2D5" w:sz="1"/>
+            </w:tcBorders>
+            <w:shd w:fill="FAF5F7" w:color="auto" w:val="clear"/>
+            <w:tcMar>
+              <w:top w:type="dxa" w:w="70"/>
+              <w:left w:type="dxa" w:w="110"/>
+              <w:bottom w:type="dxa" w:w="70"/>
+              <w:right w:type="dxa" w:w="110"/>
+            </w:tcMar>
+            <w:vAlign w:val="center"/>
+          </w:tcPr>
+          <w:p>
+            <w:r>
+              <w:rPr>
+                <w:sz w:val="19"/>
+                <w:szCs w:val="19"/>
+              </w:rPr>
+              <w:t xml:space="preserve">An order we place on a vendor to replenish stock</w:t>
+            </w:r>
+          </w:p>
+        </w:tc>
+      </w:tr>
+      <w:tr>
+        <w:tc>
+          <w:tcPr>
+            <w:tcW w:type="dxa" w:w="2600"/>
+            <w:tcBorders>
+              <w:top w:val="single" w:color="D9D2D5" w:sz="1"/>
+              <w:left w:val="single" w:color="D9D2D5" w:sz="1"/>
+              <w:bottom w:val="single" w:color="D9D2D5" w:sz="1"/>
+              <w:right w:val="single" w:color="D9D2D5" w:sz="1"/>
+            </w:tcBorders>
+            <w:tcMar>
+              <w:top w:type="dxa" w:w="70"/>
+              <w:left w:type="dxa" w:w="110"/>
+              <w:bottom w:type="dxa" w:w="70"/>
+              <w:right w:type="dxa" w:w="110"/>
+            </w:tcMar>
+            <w:vAlign w:val="center"/>
+          </w:tcPr>
+          <w:p>
+            <w:r>
+              <w:rPr>
+                <w:sz w:val="19"/>
+                <w:szCs w:val="19"/>
+              </w:rPr>
+              <w:t xml:space="preserve">Goods receipt (GRN)</w:t>
+            </w:r>
+          </w:p>
+        </w:tc>
+        <w:tc>
+          <w:tcPr>
+            <w:tcW w:type="dxa" w:w="6760"/>
+            <w:tcBorders>
+              <w:top w:val="single" w:color="D9D2D5" w:sz="1"/>
+              <w:left w:val="single" w:color="D9D2D5" w:sz="1"/>
+              <w:bottom w:val="single" w:color="D9D2D5" w:sz="1"/>
+              <w:right w:val="single" w:color="D9D2D5" w:sz="1"/>
+            </w:tcBorders>
+            <w:tcMar>
+              <w:top w:type="dxa" w:w="70"/>
+              <w:left w:type="dxa" w:w="110"/>
+              <w:bottom w:type="dxa" w:w="70"/>
+              <w:right w:type="dxa" w:w="110"/>
+            </w:tcMar>
+            <w:vAlign w:val="center"/>
+          </w:tcPr>
+          <w:p>
+            <w:r>
+              <w:rPr>
+                <w:sz w:val="19"/>
+                <w:szCs w:val="19"/>
+              </w:rPr>
+              <w:t xml:space="preserve">Recording stock received against a PO; posts ledger entries</w:t>
+            </w:r>
+          </w:p>
+        </w:tc>
+      </w:tr>
+      <w:tr>
+        <w:tc>
+          <w:tcPr>
+            <w:tcW w:type="dxa" w:w="2600"/>
+            <w:tcBorders>
+              <w:top w:val="single" w:color="D9D2D5" w:sz="1"/>
+              <w:left w:val="single" w:color="D9D2D5" w:sz="1"/>
+              <w:bottom w:val="single" w:color="D9D2D5" w:sz="1"/>
+              <w:right w:val="single" w:color="D9D2D5" w:sz="1"/>
+            </w:tcBorders>
+            <w:shd w:fill="FAF5F7" w:color="auto" w:val="clear"/>
+            <w:tcMar>
+              <w:top w:type="dxa" w:w="70"/>
+              <w:left w:type="dxa" w:w="110"/>
+              <w:bottom w:type="dxa" w:w="70"/>
+              <w:right w:type="dxa" w:w="110"/>
+            </w:tcMar>
+            <w:vAlign w:val="center"/>
+          </w:tcPr>
+          <w:p>
+            <w:r>
+              <w:rPr>
+                <w:sz w:val="19"/>
+                <w:szCs w:val="19"/>
+              </w:rPr>
+              <w:t xml:space="preserve">Replenishment</w:t>
+            </w:r>
+          </w:p>
+        </w:tc>
+        <w:tc>
+          <w:tcPr>
+            <w:tcW w:type="dxa" w:w="6760"/>
+            <w:tcBorders>
+              <w:top w:val="single" w:color="D9D2D5" w:sz="1"/>
+              <w:left w:val="single" w:color="D9D2D5" w:sz="1"/>
+              <w:bottom w:val="single" w:color="D9D2D5" w:sz="1"/>
+              <w:right w:val="single" w:color="D9D2D5" w:sz="1"/>
+            </w:tcBorders>
+            <w:shd w:fill="FAF5F7" w:color="auto" w:val="clear"/>
+            <w:tcMar>
+              <w:top w:type="dxa" w:w="70"/>
+              <w:left w:type="dxa" w:w="110"/>
+              <w:bottom w:type="dxa" w:w="70"/>
+              <w:right w:type="dxa" w:w="110"/>
+            </w:tcMar>
+            <w:vAlign w:val="center"/>
+          </w:tcPr>
+          <w:p>
+            <w:r>
+              <w:rPr>
+                <w:sz w:val="19"/>
+                <w:szCs w:val="19"/>
+              </w:rPr>
+              <w:t xml:space="preserve">Restocking via auto-PO, approval, or alert when stock is low</w:t>
             </w:r>
           </w:p>
         </w:tc>

</xml_diff>